<commit_message>
refactor(frontend): simplify pages to fetch from API, add admin panel & CMS
- Simplify all public pages (home, about, blog, courses, contact, services, study-abroad, language-programs) to fetch content from backend API instead of hardcoded data
- Add admin dashboard with collection editor, login/logout, and sidebar navigation
- Add API route for leads submission (POST /api/leads)
- Add ContactForm component alongside ConsultationForm
- Add lib/ utilities: auth, collections, content fetching, JSON tree handler
- Add proxy.ts for API proxying in dev
- Add content/ JSON seed files for CMS
- Update Footer links and styling
- Add docs/HISTORY.md changelog
- Update .gitignore
</commit_message>
<xml_diff>
--- a/docs/scope-mingguan-istudentplus.docx
+++ b/docs/scope-mingguan-istudentplus.docx
@@ -39,7 +39,7 @@
           <w:sz w:val="21"/>
           <w:szCs w:val="21"/>
         </w:rPr>
-        <w:t xml:space="preserve">Scope Pekerjaan Mingguan — 8–14 Juli 2026</w:t>
+        <w:t xml:space="preserve">Update — 21 Juli 2026</w:t>
       </w:r>
     </w:p>
     <w:p>
@@ -74,7 +74,7 @@
           <w:sz w:val="21"/>
           <w:szCs w:val="21"/>
         </w:rPr>
-        <w:t xml:space="preserve">Fondasi sudah berjalan: project di-scaffold dengan Next.js 16 + TypeScript + Tailwind, desain baru (light theme, warna navy &amp; pink dari logo asli iStudentPlus) sudah diterapkan, dan 5 halaman inti (Beranda, About Us, Study Abroad, Blog, Contact) sudah dibangun memakai konten nyata hasil audit situs WordPress lama. Minggu ini fokus melengkapi fondasi SEO/GEO, menambah halaman dinamis, dan menyiapkan staging untuk direview.</w:t>
+        <w:t xml:space="preserve">Situs sudah jauh melampaui rencana awal minggu pertama: 14+ halaman live (bukan 7), CMS admin penuh sudah dibangun (awalnya direncanakan minggu depan), dan seluruh konten sudah memakai data asli hasil audit brief PPT klien — bukan lagi placeholder. Yang masih tertinggal dari rencana SEO/GEO teknis (sitemap, robots.txt, llms.txt) dan staging deploy, dipindah ke sisa minggu ini.</w:t>
       </w:r>
     </w:p>
     <w:p>
@@ -88,87 +88,319 @@
           <w:bCs/>
           <w:color w:val="14304C"/>
         </w:rPr>
-        <w:t xml:space="preserve">Tujuan Minggu Ini</w:t>
-      </w:r>
-    </w:p>
-    <w:p>
-      <w:pPr>
-        <w:pStyle w:val="ListParagraph"/>
-        <w:numPr>
-          <w:ilvl w:val="0"/>
-          <w:numId w:val="2"/>
-        </w:numPr>
-        <w:spacing w:after="60"/>
-      </w:pPr>
-      <w:r>
-        <w:rPr>
-          <w:b w:val="false"/>
-          <w:bCs w:val="false"/>
+        <w:t xml:space="preserve">Checklist — Sudah Selesai</w:t>
+      </w:r>
+    </w:p>
+    <w:p>
+      <w:pPr>
+        <w:spacing w:after="70"/>
+        <w:ind w:left="200"/>
+      </w:pPr>
+      <w:r>
+        <w:rPr>
+          <w:b/>
+          <w:bCs/>
+          <w:color w:val="1E8E5A"/>
+          <w:sz w:val="21"/>
+          <w:szCs w:val="21"/>
+        </w:rPr>
+        <w:t xml:space="preserve">✓  </w:t>
+      </w:r>
+      <w:r>
+        <w:rPr>
           <w:color w:val="222222"/>
           <w:sz w:val="21"/>
           <w:szCs w:val="21"/>
         </w:rPr>
-        <w:t xml:space="preserve">Konten seluruh halaman memakai data nyata (bukan placeholder), termasuk halaman destinasi.</w:t>
-      </w:r>
-    </w:p>
-    <w:p>
-      <w:pPr>
-        <w:pStyle w:val="ListParagraph"/>
-        <w:numPr>
-          <w:ilvl w:val="0"/>
-          <w:numId w:val="2"/>
-        </w:numPr>
-        <w:spacing w:after="60"/>
-      </w:pPr>
-      <w:r>
-        <w:rPr>
-          <w:b w:val="false"/>
-          <w:bCs w:val="false"/>
+        <w:t xml:space="preserve">Struktur situs lengkap: nav dropdown, Home, About Us, Study Abroad (6 negara), Services, Courses &amp; Universities, Language Programs, Blog, Contact</w:t>
+      </w:r>
+    </w:p>
+    <w:p>
+      <w:pPr>
+        <w:spacing w:after="70"/>
+        <w:ind w:left="200"/>
+      </w:pPr>
+      <w:r>
+        <w:rPr>
+          <w:b/>
+          <w:bCs/>
+          <w:color w:val="1E8E5A"/>
+          <w:sz w:val="21"/>
+          <w:szCs w:val="21"/>
+        </w:rPr>
+        <w:t xml:space="preserve">✓  </w:t>
+      </w:r>
+      <w:r>
+        <w:rPr>
           <w:color w:val="222222"/>
           <w:sz w:val="21"/>
           <w:szCs w:val="21"/>
         </w:rPr>
-        <w:t xml:space="preserve">Fondasi teknis SEO &amp; GEO terpasang: sitemap, robots.txt, structured data, llms.txt.</w:t>
-      </w:r>
-    </w:p>
-    <w:p>
-      <w:pPr>
-        <w:pStyle w:val="ListParagraph"/>
-        <w:numPr>
-          <w:ilvl w:val="0"/>
-          <w:numId w:val="2"/>
-        </w:numPr>
-        <w:spacing w:after="60"/>
-      </w:pPr>
-      <w:r>
-        <w:rPr>
-          <w:b w:val="false"/>
-          <w:bCs w:val="false"/>
+        <w:t xml:space="preserve">Konten &amp; aset asli dari brief PPT klien diterapkan (foto tim, instruktur, sertifikasi QEAC/ISEAA, data kursus, 6 layanan visa termasuk IMMagine &amp; Middow)</w:t>
+      </w:r>
+    </w:p>
+    <w:p>
+      <w:pPr>
+        <w:spacing w:after="70"/>
+        <w:ind w:left="200"/>
+      </w:pPr>
+      <w:r>
+        <w:rPr>
+          <w:b/>
+          <w:bCs/>
+          <w:color w:val="1E8E5A"/>
+          <w:sz w:val="21"/>
+          <w:szCs w:val="21"/>
+        </w:rPr>
+        <w:t xml:space="preserve">✓  </w:t>
+      </w:r>
+      <w:r>
+        <w:rPr>
           <w:color w:val="222222"/>
           <w:sz w:val="21"/>
           <w:szCs w:val="21"/>
         </w:rPr>
-        <w:t xml:space="preserve">Halaman dinamis (detail destinasi &amp; detail artikel blog) berfungsi.</w:t>
-      </w:r>
-    </w:p>
-    <w:p>
-      <w:pPr>
-        <w:pStyle w:val="ListParagraph"/>
-        <w:numPr>
-          <w:ilvl w:val="0"/>
-          <w:numId w:val="2"/>
-        </w:numPr>
-        <w:spacing w:after="60"/>
-      </w:pPr>
-      <w:r>
-        <w:rPr>
-          <w:b w:val="false"/>
-          <w:bCs w:val="false"/>
+        <w:t xml:space="preserve">Koreksi data penting: kantor Pangkalpinang &amp; Makassar (bukan Sydney), tim asli Cindy Christella &amp; Nur Fadillah</w:t>
+      </w:r>
+    </w:p>
+    <w:p>
+      <w:pPr>
+        <w:spacing w:after="70"/>
+        <w:ind w:left="200"/>
+      </w:pPr>
+      <w:r>
+        <w:rPr>
+          <w:b/>
+          <w:bCs/>
+          <w:color w:val="1E8E5A"/>
+          <w:sz w:val="21"/>
+          <w:szCs w:val="21"/>
+        </w:rPr>
+        <w:t xml:space="preserve">✓  </w:t>
+      </w:r>
+      <w:r>
+        <w:rPr>
           <w:color w:val="222222"/>
           <w:sz w:val="21"/>
           <w:szCs w:val="21"/>
         </w:rPr>
-        <w:t xml:space="preserve">Situs lolos QA responsif dasar dan siap direview di staging.</w:t>
+        <w:t xml:space="preserve">UI/UX di-restyle mengikuti referensi visual dari PPT (hero, kartu layanan, timeline perjalanan, testimoni)</w:t>
+      </w:r>
+    </w:p>
+    <w:p>
+      <w:pPr>
+        <w:spacing w:after="70"/>
+        <w:ind w:left="200"/>
+      </w:pPr>
+      <w:r>
+        <w:rPr>
+          <w:b/>
+          <w:bCs/>
+          <w:color w:val="1E8E5A"/>
+          <w:sz w:val="21"/>
+          <w:szCs w:val="21"/>
+        </w:rPr>
+        <w:t xml:space="preserve">✓  </w:t>
+      </w:r>
+      <w:r>
+        <w:rPr>
+          <w:color w:val="222222"/>
+          <w:sz w:val="21"/>
+          <w:szCs w:val="21"/>
+        </w:rPr>
+        <w:t xml:space="preserve">Responsif penuh — teruji di mobile (375px) &amp; tablet (768px) untuk semua halaman, termasuk perbaikan bug overflow &amp; nav</w:t>
+      </w:r>
+    </w:p>
+    <w:p>
+      <w:pPr>
+        <w:spacing w:after="70"/>
+        <w:ind w:left="200"/>
+      </w:pPr>
+      <w:r>
+        <w:rPr>
+          <w:b/>
+          <w:bCs/>
+          <w:color w:val="1E8E5A"/>
+          <w:sz w:val="21"/>
+          <w:szCs w:val="21"/>
+        </w:rPr>
+        <w:t xml:space="preserve">✓  </w:t>
+      </w:r>
+      <w:r>
+        <w:rPr>
+          <w:color w:val="222222"/>
+          <w:sz w:val="21"/>
+          <w:szCs w:val="21"/>
+        </w:rPr>
+        <w:t xml:space="preserve">CMS admin di /admin — 9 koleksi konten, login aman, editor otomatis untuk semua jenis data (termasuk data bersarang seperti halaman negara)</w:t>
+      </w:r>
+    </w:p>
+    <w:p>
+      <w:pPr>
+        <w:spacing w:after="70"/>
+        <w:ind w:left="200"/>
+      </w:pPr>
+      <w:r>
+        <w:rPr>
+          <w:b/>
+          <w:bCs/>
+          <w:color w:val="1E8E5A"/>
+          <w:sz w:val="21"/>
+          <w:szCs w:val="21"/>
+        </w:rPr>
+        <w:t xml:space="preserve">✓  </w:t>
+      </w:r>
+      <w:r>
+        <w:rPr>
+          <w:color w:val="222222"/>
+          <w:sz w:val="21"/>
+          <w:szCs w:val="21"/>
+        </w:rPr>
+        <w:t xml:space="preserve">SEO dasar: metadata per halaman, structured data Organization + FAQPage</w:t>
+      </w:r>
+    </w:p>
+    <w:p>
+      <w:pPr>
+        <w:spacing w:after="70"/>
+        <w:ind w:left="200"/>
+      </w:pPr>
+      <w:r>
+        <w:rPr>
+          <w:b/>
+          <w:bCs/>
+          <w:color w:val="1E8E5A"/>
+          <w:sz w:val="21"/>
+          <w:szCs w:val="21"/>
+        </w:rPr>
+        <w:t xml:space="preserve">✓  </w:t>
+      </w:r>
+      <w:r>
+        <w:rPr>
+          <w:color w:val="222222"/>
+          <w:sz w:val="21"/>
+          <w:szCs w:val="21"/>
+        </w:rPr>
+        <w:t xml:space="preserve">Laporan progress mingguan (slide PPT) sudah dikirim</w:t>
+      </w:r>
+    </w:p>
+    <w:p>
+      <w:pPr>
+        <w:spacing w:after="70"/>
+        <w:ind w:left="200"/>
+      </w:pPr>
+      <w:r>
+        <w:rPr>
+          <w:b/>
+          <w:bCs/>
+          <w:color w:val="C88A0A"/>
+          <w:sz w:val="21"/>
+          <w:szCs w:val="21"/>
+        </w:rPr>
+        <w:t xml:space="preserve">✗  </w:t>
+      </w:r>
+      <w:r>
+        <w:rPr>
+          <w:color w:val="222222"/>
+          <w:sz w:val="21"/>
+          <w:szCs w:val="21"/>
+        </w:rPr>
+        <w:t xml:space="preserve">sitemap.xml, robots.txt, llms.txt</w:t>
+      </w:r>
+    </w:p>
+    <w:p>
+      <w:pPr>
+        <w:spacing w:after="70"/>
+        <w:ind w:left="200"/>
+      </w:pPr>
+      <w:r>
+        <w:rPr>
+          <w:b/>
+          <w:bCs/>
+          <w:color w:val="C88A0A"/>
+          <w:sz w:val="21"/>
+          <w:szCs w:val="21"/>
+        </w:rPr>
+        <w:t xml:space="preserve">✗  </w:t>
+      </w:r>
+      <w:r>
+        <w:rPr>
+          <w:color w:val="222222"/>
+          <w:sz w:val="21"/>
+          <w:szCs w:val="21"/>
+        </w:rPr>
+        <w:t xml:space="preserve">Structured data tambahan (BreadcrumbList, Article schema blog)</w:t>
+      </w:r>
+    </w:p>
+    <w:p>
+      <w:pPr>
+        <w:spacing w:after="70"/>
+        <w:ind w:left="200"/>
+      </w:pPr>
+      <w:r>
+        <w:rPr>
+          <w:b/>
+          <w:bCs/>
+          <w:color w:val="C88A0A"/>
+          <w:sz w:val="21"/>
+          <w:szCs w:val="21"/>
+        </w:rPr>
+        <w:t xml:space="preserve">✗  </w:t>
+      </w:r>
+      <w:r>
+        <w:rPr>
+          <w:color w:val="222222"/>
+          <w:sz w:val="21"/>
+          <w:szCs w:val="21"/>
+        </w:rPr>
+        <w:t xml:space="preserve">Form kontak &amp; konsultasi tersambung ke backend sungguhan</w:t>
+      </w:r>
+    </w:p>
+    <w:p>
+      <w:pPr>
+        <w:spacing w:after="70"/>
+        <w:ind w:left="200"/>
+      </w:pPr>
+      <w:r>
+        <w:rPr>
+          <w:b/>
+          <w:bCs/>
+          <w:color w:val="C88A0A"/>
+          <w:sz w:val="21"/>
+          <w:szCs w:val="21"/>
+        </w:rPr>
+        <w:t xml:space="preserve">✗  </w:t>
+      </w:r>
+      <w:r>
+        <w:rPr>
+          <w:color w:val="222222"/>
+          <w:sz w:val="21"/>
+          <w:szCs w:val="21"/>
+        </w:rPr>
+        <w:t xml:space="preserve">Deploy staging</w:t>
+      </w:r>
+    </w:p>
+    <w:p>
+      <w:pPr>
+        <w:spacing w:after="70"/>
+        <w:ind w:left="200"/>
+      </w:pPr>
+      <w:r>
+        <w:rPr>
+          <w:b/>
+          <w:bCs/>
+          <w:color w:val="C88A0A"/>
+          <w:sz w:val="21"/>
+          <w:szCs w:val="21"/>
+        </w:rPr>
+        <w:t xml:space="preserve">✗  </w:t>
+      </w:r>
+      <w:r>
+        <w:rPr>
+          <w:color w:val="222222"/>
+          <w:sz w:val="21"/>
+          <w:szCs w:val="21"/>
+        </w:rPr>
+        <w:t xml:space="preserve">Migrasi CMS dari file JSON ke database (wajib sebelum go-live di hosting serverless)</w:t>
       </w:r>
     </w:p>
     <w:p>
@@ -182,7 +414,7 @@
           <w:bCs/>
           <w:color w:val="14304C"/>
         </w:rPr>
-        <w:t xml:space="preserve">Rencana Harian</w:t>
+        <w:t xml:space="preserve">Status Minggu Ini (20–24 Juli 2026)</w:t>
       </w:r>
     </w:p>
     <w:tbl>
@@ -339,22 +571,22 @@
                 <w:sz w:val="20"/>
                 <w:szCs w:val="20"/>
               </w:rPr>
-              <w:t xml:space="preserve">Rab</w:t>
-            </w:r>
-          </w:p>
-          <w:p>
-            <w:pPr>
-              <w:spacing w:after="0"/>
-            </w:pPr>
-            <w:r>
-              <w:rPr>
-                <w:b/>
-                <w:bCs/>
-                <w:color w:val="222222"/>
-                <w:sz w:val="20"/>
-                <w:szCs w:val="20"/>
-              </w:rPr>
-              <w:t xml:space="preserve">8 Jul</w:t>
+              <w:t xml:space="preserve">Sen–Sel</w:t>
+            </w:r>
+          </w:p>
+          <w:p>
+            <w:pPr>
+              <w:spacing w:after="0"/>
+            </w:pPr>
+            <w:r>
+              <w:rPr>
+                <w:b/>
+                <w:bCs/>
+                <w:color w:val="222222"/>
+                <w:sz w:val="20"/>
+                <w:szCs w:val="20"/>
+              </w:rPr>
+              <w:t xml:space="preserve">20–21 Jul</w:t>
             </w:r>
           </w:p>
         </w:tc>
@@ -380,7 +612,7 @@
                 <w:sz w:val="20"/>
                 <w:szCs w:val="20"/>
               </w:rPr>
-              <w:t xml:space="preserve">Audit Konten &amp; Teknis</w:t>
+              <w:t xml:space="preserve">CMS + Konten Asli dari Brief Klien</w:t>
             </w:r>
           </w:p>
         </w:tc>
@@ -406,7 +638,7 @@
                 <w:sz w:val="20"/>
                 <w:szCs w:val="20"/>
               </w:rPr>
-              <w:t xml:space="preserve">• Audit konten asli WordPress vs data yang sudah dipakai di mockup</w:t>
+              <w:t xml:space="preserve">• Bangun CMS admin (/admin) — 9 collection, auth login, editor generik untuk semua data</w:t>
             </w:r>
           </w:p>
           <w:p>
@@ -421,37 +653,22 @@
                 <w:sz w:val="20"/>
                 <w:szCs w:val="20"/>
               </w:rPr>
-              <w:t xml:space="preserve">• Kumpulkan konten nyata untuk halaman destinasi (Australia, Malaysia, Jepang, Korea) — halaman lama isinya masih demo tema</w:t>
-            </w:r>
-          </w:p>
-          <w:p>
-            <w:pPr>
-              <w:spacing w:after="60"/>
-            </w:pPr>
-            <w:r>
-              <w:rPr>
-                <w:b w:val="false"/>
-                <w:bCs w:val="false"/>
-                <w:color w:val="222222"/>
-                <w:sz w:val="20"/>
-                <w:szCs w:val="20"/>
-              </w:rPr>
-              <w:t xml:space="preserve">• Verifikasi ulang kontak resmi (telepon, email, alamat kantor) — data di web lama tidak valid</w:t>
-            </w:r>
-          </w:p>
-          <w:p>
-            <w:pPr>
-              <w:spacing w:after="0"/>
-            </w:pPr>
-            <w:r>
-              <w:rPr>
-                <w:b w:val="false"/>
-                <w:bCs w:val="false"/>
-                <w:color w:val="222222"/>
-                <w:sz w:val="20"/>
-                <w:szCs w:val="20"/>
-              </w:rPr>
-              <w:t xml:space="preserve">• Setup sitemap.xml &amp; robots.txt dasar</w:t>
+              <w:t xml:space="preserve">• Ekstrak aset &amp; data asli dari panduan PPT klien (foto tim, instruktur, sertifikasi, data kursus, layanan visa)</w:t>
+            </w:r>
+          </w:p>
+          <w:p>
+            <w:pPr>
+              <w:spacing w:after="0"/>
+            </w:pPr>
+            <w:r>
+              <w:rPr>
+                <w:b w:val="false"/>
+                <w:bCs w:val="false"/>
+                <w:color w:val="222222"/>
+                <w:sz w:val="20"/>
+                <w:szCs w:val="20"/>
+              </w:rPr>
+              <w:t xml:space="preserve">• Sambungkan seluruh halaman publik ke CMS (bukan lagi data hardcode)</w:t>
             </w:r>
           </w:p>
         </w:tc>
@@ -477,7 +694,7 @@
                 <w:sz w:val="20"/>
                 <w:szCs w:val="20"/>
               </w:rPr>
-              <w:t xml:space="preserve">Daftar konten final + sitemap/robots</w:t>
+              <w:t xml:space="preserve">CMS live + situs 100% pakai data nyata</w:t>
             </w:r>
           </w:p>
         </w:tc>
@@ -505,22 +722,22 @@
                 <w:sz w:val="20"/>
                 <w:szCs w:val="20"/>
               </w:rPr>
-              <w:t xml:space="preserve">Kam</w:t>
-            </w:r>
-          </w:p>
-          <w:p>
-            <w:pPr>
-              <w:spacing w:after="0"/>
-            </w:pPr>
-            <w:r>
-              <w:rPr>
-                <w:b/>
-                <w:bCs/>
-                <w:color w:val="222222"/>
-                <w:sz w:val="20"/>
-                <w:szCs w:val="20"/>
-              </w:rPr>
-              <w:t xml:space="preserve">9 Jul</w:t>
+              <w:t xml:space="preserve">Rab</w:t>
+            </w:r>
+          </w:p>
+          <w:p>
+            <w:pPr>
+              <w:spacing w:after="0"/>
+            </w:pPr>
+            <w:r>
+              <w:rPr>
+                <w:b/>
+                <w:bCs/>
+                <w:color w:val="222222"/>
+                <w:sz w:val="20"/>
+                <w:szCs w:val="20"/>
+              </w:rPr>
+              <w:t xml:space="preserve">22 Jul</w:t>
             </w:r>
           </w:p>
         </w:tc>
@@ -546,7 +763,7 @@
                 <w:sz w:val="20"/>
                 <w:szCs w:val="20"/>
               </w:rPr>
-              <w:t xml:space="preserve">SEO &amp; GEO Foundation</w:t>
+              <w:t xml:space="preserve">Restyle UI &amp; Perbaikan Responsif</w:t>
             </w:r>
           </w:p>
         </w:tc>
@@ -572,7 +789,7 @@
                 <w:sz w:val="20"/>
                 <w:szCs w:val="20"/>
               </w:rPr>
-              <w:t xml:space="preserve">• Metadata per halaman (title, description, OG image) untuk 5 halaman yang sudah ada</w:t>
+              <w:t xml:space="preserve">• Terapkan pola UI/UX sesuai referensi visual di PPT (hero, kartu layanan, timeline, testimoni)</w:t>
             </w:r>
           </w:p>
           <w:p>
@@ -587,37 +804,22 @@
                 <w:sz w:val="20"/>
                 <w:szCs w:val="20"/>
               </w:rPr>
-              <w:t xml:space="preserve">• Structured data tambahan: BreadcrumbList, FAQPage, Article schema untuk blog</w:t>
-            </w:r>
-          </w:p>
-          <w:p>
-            <w:pPr>
-              <w:spacing w:after="60"/>
-            </w:pPr>
-            <w:r>
-              <w:rPr>
-                <w:b w:val="false"/>
-                <w:bCs w:val="false"/>
-                <w:color w:val="222222"/>
-                <w:sz w:val="20"/>
-                <w:szCs w:val="20"/>
-              </w:rPr>
-              <w:t xml:space="preserve">• Buat llms.txt untuk GEO (ringkasan machine-readable untuk AI answer engine)</w:t>
-            </w:r>
-          </w:p>
-          <w:p>
-            <w:pPr>
-              <w:spacing w:after="0"/>
-            </w:pPr>
-            <w:r>
-              <w:rPr>
-                <w:b w:val="false"/>
-                <w:bCs w:val="false"/>
-                <w:color w:val="222222"/>
-                <w:sz w:val="20"/>
-                <w:szCs w:val="20"/>
-              </w:rPr>
-              <w:t xml:space="preserve">• Cek internal linking antar halaman</w:t>
+              <w:t xml:space="preserve">• Perbaikan bug tampilan (teks overflow, nav mobile, overlap kartu)</w:t>
+            </w:r>
+          </w:p>
+          <w:p>
+            <w:pPr>
+              <w:spacing w:after="0"/>
+            </w:pPr>
+            <w:r>
+              <w:rPr>
+                <w:b w:val="false"/>
+                <w:bCs w:val="false"/>
+                <w:color w:val="222222"/>
+                <w:sz w:val="20"/>
+                <w:szCs w:val="20"/>
+              </w:rPr>
+              <w:t xml:space="preserve">• Uji responsif penuh di mobile (375px) &amp; tablet (768px) — seluruh 14 halaman</w:t>
             </w:r>
           </w:p>
         </w:tc>
@@ -643,7 +845,7 @@
                 <w:sz w:val="20"/>
                 <w:szCs w:val="20"/>
               </w:rPr>
-              <w:t xml:space="preserve">Metadata + schema + llms.txt live</w:t>
+              <w:t xml:space="preserve">UI sesuai referensi + lolos QA responsif</w:t>
             </w:r>
           </w:p>
         </w:tc>
@@ -671,22 +873,22 @@
                 <w:sz w:val="20"/>
                 <w:szCs w:val="20"/>
               </w:rPr>
-              <w:t xml:space="preserve">Jum</w:t>
-            </w:r>
-          </w:p>
-          <w:p>
-            <w:pPr>
-              <w:spacing w:after="0"/>
-            </w:pPr>
-            <w:r>
-              <w:rPr>
-                <w:b/>
-                <w:bCs/>
-                <w:color w:val="222222"/>
-                <w:sz w:val="20"/>
-                <w:szCs w:val="20"/>
-              </w:rPr>
-              <w:t xml:space="preserve">10 Jul</w:t>
+              <w:t xml:space="preserve">Kam</w:t>
+            </w:r>
+          </w:p>
+          <w:p>
+            <w:pPr>
+              <w:spacing w:after="0"/>
+            </w:pPr>
+            <w:r>
+              <w:rPr>
+                <w:b/>
+                <w:bCs/>
+                <w:color w:val="222222"/>
+                <w:sz w:val="20"/>
+                <w:szCs w:val="20"/>
+              </w:rPr>
+              <w:t xml:space="preserve">23 Jul</w:t>
             </w:r>
           </w:p>
         </w:tc>
@@ -712,7 +914,7 @@
                 <w:sz w:val="20"/>
                 <w:szCs w:val="20"/>
               </w:rPr>
-              <w:t xml:space="preserve">Halaman Dinamis</w:t>
+              <w:t xml:space="preserve">SEO Teknis (belum dikerjakan)</w:t>
             </w:r>
           </w:p>
         </w:tc>
@@ -738,7 +940,7 @@
                 <w:sz w:val="20"/>
                 <w:szCs w:val="20"/>
               </w:rPr>
-              <w:t xml:space="preserve">• Halaman detail destinasi per negara (/study-abroad/[country])</w:t>
+              <w:t xml:space="preserve">• sitemap.xml &amp; robots.txt</w:t>
             </w:r>
           </w:p>
           <w:p>
@@ -753,22 +955,22 @@
                 <w:sz w:val="20"/>
                 <w:szCs w:val="20"/>
               </w:rPr>
-              <w:t xml:space="preserve">• Halaman detail artikel blog (/blog/[slug])</w:t>
-            </w:r>
-          </w:p>
-          <w:p>
-            <w:pPr>
-              <w:spacing w:after="0"/>
-            </w:pPr>
-            <w:r>
-              <w:rPr>
-                <w:b w:val="false"/>
-                <w:bCs w:val="false"/>
-                <w:color w:val="222222"/>
-                <w:sz w:val="20"/>
-                <w:szCs w:val="20"/>
-              </w:rPr>
-              <w:t xml:space="preserve">• Struktur data program/course lokal (TypeScript) agar mudah diisi ulang</w:t>
+              <w:t xml:space="preserve">• llms.txt untuk GEO (ringkasan machine-readable)</w:t>
+            </w:r>
+          </w:p>
+          <w:p>
+            <w:pPr>
+              <w:spacing w:after="0"/>
+            </w:pPr>
+            <w:r>
+              <w:rPr>
+                <w:b w:val="false"/>
+                <w:bCs w:val="false"/>
+                <w:color w:val="222222"/>
+                <w:sz w:val="20"/>
+                <w:szCs w:val="20"/>
+              </w:rPr>
+              <w:t xml:space="preserve">• Structured data tambahan: BreadcrumbList, Article schema untuk blog</w:t>
             </w:r>
           </w:p>
         </w:tc>
@@ -794,7 +996,7 @@
                 <w:sz w:val="20"/>
                 <w:szCs w:val="20"/>
               </w:rPr>
-              <w:t xml:space="preserve">Route dinamis destinasi &amp; blog</w:t>
+              <w:t xml:space="preserve">Fondasi SEO/GEO lengkap</w:t>
             </w:r>
           </w:p>
         </w:tc>
@@ -822,22 +1024,22 @@
                 <w:sz w:val="20"/>
                 <w:szCs w:val="20"/>
               </w:rPr>
-              <w:t xml:space="preserve">Sen</w:t>
-            </w:r>
-          </w:p>
-          <w:p>
-            <w:pPr>
-              <w:spacing w:after="0"/>
-            </w:pPr>
-            <w:r>
-              <w:rPr>
-                <w:b/>
-                <w:bCs/>
-                <w:color w:val="222222"/>
-                <w:sz w:val="20"/>
-                <w:szCs w:val="20"/>
-              </w:rPr>
-              <w:t xml:space="preserve">13 Jul</w:t>
+              <w:t xml:space="preserve">Jum</w:t>
+            </w:r>
+          </w:p>
+          <w:p>
+            <w:pPr>
+              <w:spacing w:after="0"/>
+            </w:pPr>
+            <w:r>
+              <w:rPr>
+                <w:b/>
+                <w:bCs/>
+                <w:color w:val="222222"/>
+                <w:sz w:val="20"/>
+                <w:szCs w:val="20"/>
+              </w:rPr>
+              <w:t xml:space="preserve">24 Jul</w:t>
             </w:r>
           </w:p>
         </w:tc>
@@ -863,7 +1065,7 @@
                 <w:sz w:val="20"/>
                 <w:szCs w:val="20"/>
               </w:rPr>
-              <w:t xml:space="preserve">QA, Responsive &amp; Performance</w:t>
+              <w:t xml:space="preserve">Staging &amp; Handover (belum dikerjakan)</w:t>
             </w:r>
           </w:p>
         </w:tc>
@@ -889,7 +1091,7 @@
                 <w:sz w:val="20"/>
                 <w:szCs w:val="20"/>
               </w:rPr>
-              <w:t xml:space="preserve">• Uji semua halaman di mobile / tablet / desktop</w:t>
+              <w:t xml:space="preserve">• Rencanakan migrasi CMS dari file JSON ke database (perlu sebelum go-live di hosting serverless)</w:t>
             </w:r>
           </w:p>
           <w:p>
@@ -904,37 +1106,22 @@
                 <w:sz w:val="20"/>
                 <w:szCs w:val="20"/>
               </w:rPr>
-              <w:t xml:space="preserve">• Optimasi gambar (next/image, ukuran, lazy load)</w:t>
-            </w:r>
-          </w:p>
-          <w:p>
-            <w:pPr>
-              <w:spacing w:after="60"/>
-            </w:pPr>
-            <w:r>
-              <w:rPr>
-                <w:b w:val="false"/>
-                <w:bCs w:val="false"/>
-                <w:color w:val="222222"/>
-                <w:sz w:val="20"/>
-                <w:szCs w:val="20"/>
-              </w:rPr>
-              <w:t xml:space="preserve">• Cek Core Web Vitals dasar (Lighthouse)</w:t>
-            </w:r>
-          </w:p>
-          <w:p>
-            <w:pPr>
-              <w:spacing w:after="0"/>
-            </w:pPr>
-            <w:r>
-              <w:rPr>
-                <w:b w:val="false"/>
-                <w:bCs w:val="false"/>
-                <w:color w:val="222222"/>
-                <w:sz w:val="20"/>
-                <w:szCs w:val="20"/>
-              </w:rPr>
-              <w:t xml:space="preserve">• Accessibility pass (kontras warna, alt text, keyboard nav)</w:t>
+              <w:t xml:space="preserve">• Deploy ke staging</w:t>
+            </w:r>
+          </w:p>
+          <w:p>
+            <w:pPr>
+              <w:spacing w:after="0"/>
+            </w:pPr>
+            <w:r>
+              <w:rPr>
+                <w:b w:val="false"/>
+                <w:bCs w:val="false"/>
+                <w:color w:val="222222"/>
+                <w:sz w:val="20"/>
+                <w:szCs w:val="20"/>
+              </w:rPr>
+              <w:t xml:space="preserve">• Serah terima kredensial admin &amp; dokumentasi ke tim</w:t>
             </w:r>
           </w:p>
         </w:tc>
@@ -960,173 +1147,7 @@
                 <w:sz w:val="20"/>
                 <w:szCs w:val="20"/>
               </w:rPr>
-              <w:t xml:space="preserve">QA report + fix list</w:t>
-            </w:r>
-          </w:p>
-        </w:tc>
-      </w:tr>
-      <w:tr>
-        <w:tc>
-          <w:tcPr>
-            <w:tcW w:type="dxa" w:w="1400"/>
-            <w:tcMar>
-              <w:top w:type="dxa" w:w="100"/>
-              <w:left w:type="dxa" w:w="120"/>
-              <w:bottom w:type="dxa" w:w="100"/>
-              <w:right w:type="dxa" w:w="120"/>
-            </w:tcMar>
-          </w:tcPr>
-          <w:p>
-            <w:pPr>
-              <w:spacing w:after="60"/>
-            </w:pPr>
-            <w:r>
-              <w:rPr>
-                <w:b/>
-                <w:bCs/>
-                <w:color w:val="222222"/>
-                <w:sz w:val="20"/>
-                <w:szCs w:val="20"/>
-              </w:rPr>
-              <w:t xml:space="preserve">Sel</w:t>
-            </w:r>
-          </w:p>
-          <w:p>
-            <w:pPr>
-              <w:spacing w:after="0"/>
-            </w:pPr>
-            <w:r>
-              <w:rPr>
-                <w:b/>
-                <w:bCs/>
-                <w:color w:val="222222"/>
-                <w:sz w:val="20"/>
-                <w:szCs w:val="20"/>
-              </w:rPr>
-              <w:t xml:space="preserve">14 Jul</w:t>
-            </w:r>
-          </w:p>
-        </w:tc>
-        <w:tc>
-          <w:tcPr>
-            <w:tcW w:type="dxa" w:w="2000"/>
-            <w:tcMar>
-              <w:top w:type="dxa" w:w="100"/>
-              <w:left w:type="dxa" w:w="120"/>
-              <w:bottom w:type="dxa" w:w="100"/>
-              <w:right w:type="dxa" w:w="120"/>
-            </w:tcMar>
-          </w:tcPr>
-          <w:p>
-            <w:pPr>
-              <w:spacing w:after="0"/>
-            </w:pPr>
-            <w:r>
-              <w:rPr>
-                <w:b/>
-                <w:bCs/>
-                <w:color w:val="222222"/>
-                <w:sz w:val="20"/>
-                <w:szCs w:val="20"/>
-              </w:rPr>
-              <w:t xml:space="preserve">Staging &amp; Handover</w:t>
-            </w:r>
-          </w:p>
-        </w:tc>
-        <w:tc>
-          <w:tcPr>
-            <w:tcW w:type="dxa" w:w="4600"/>
-            <w:tcMar>
-              <w:top w:type="dxa" w:w="100"/>
-              <w:left w:type="dxa" w:w="120"/>
-              <w:bottom w:type="dxa" w:w="100"/>
-              <w:right w:type="dxa" w:w="120"/>
-            </w:tcMar>
-          </w:tcPr>
-          <w:p>
-            <w:pPr>
-              <w:spacing w:after="60"/>
-            </w:pPr>
-            <w:r>
-              <w:rPr>
-                <w:b w:val="false"/>
-                <w:bCs w:val="false"/>
-                <w:color w:val="222222"/>
-                <w:sz w:val="20"/>
-                <w:szCs w:val="20"/>
-              </w:rPr>
-              <w:t xml:space="preserve">• Deploy ke staging (Vercel)</w:t>
-            </w:r>
-          </w:p>
-          <w:p>
-            <w:pPr>
-              <w:spacing w:after="60"/>
-            </w:pPr>
-            <w:r>
-              <w:rPr>
-                <w:b w:val="false"/>
-                <w:bCs w:val="false"/>
-                <w:color w:val="222222"/>
-                <w:sz w:val="20"/>
-                <w:szCs w:val="20"/>
-              </w:rPr>
-              <w:t xml:space="preserve">• Review bersama tim/stakeholder</w:t>
-            </w:r>
-          </w:p>
-          <w:p>
-            <w:pPr>
-              <w:spacing w:after="60"/>
-            </w:pPr>
-            <w:r>
-              <w:rPr>
-                <w:b w:val="false"/>
-                <w:bCs w:val="false"/>
-                <w:color w:val="222222"/>
-                <w:sz w:val="20"/>
-                <w:szCs w:val="20"/>
-              </w:rPr>
-              <w:t xml:space="preserve">• Dokumentasi struktur project</w:t>
-            </w:r>
-          </w:p>
-          <w:p>
-            <w:pPr>
-              <w:spacing w:after="0"/>
-            </w:pPr>
-            <w:r>
-              <w:rPr>
-                <w:b w:val="false"/>
-                <w:bCs w:val="false"/>
-                <w:color w:val="222222"/>
-                <w:sz w:val="20"/>
-                <w:szCs w:val="20"/>
-              </w:rPr>
-              <w:t xml:space="preserve">• Susun backlog minggu depan</w:t>
-            </w:r>
-          </w:p>
-        </w:tc>
-        <w:tc>
-          <w:tcPr>
-            <w:tcW w:type="dxa" w:w="1800"/>
-            <w:tcMar>
-              <w:top w:type="dxa" w:w="100"/>
-              <w:left w:type="dxa" w:w="120"/>
-              <w:bottom w:type="dxa" w:w="100"/>
-              <w:right w:type="dxa" w:w="120"/>
-            </w:tcMar>
-          </w:tcPr>
-          <w:p>
-            <w:pPr>
-              <w:spacing w:after="0"/>
-            </w:pPr>
-            <w:r>
-              <w:rPr>
-                <w:b w:val="false"/>
-                <w:bCs w:val="false"/>
-                <w:color w:val="222222"/>
-                <w:sz w:val="20"/>
-                <w:szCs w:val="20"/>
-              </w:rPr>
-              <w:t xml:space="preserve">URL staging + backlog minggu depan</w:t>
+              <w:t xml:space="preserve">URL staging + kredensial admin diserahkan</w:t>
             </w:r>
           </w:p>
         </w:tc>
@@ -1143,7 +1164,7 @@
           <w:bCs/>
           <w:color w:val="14304C"/>
         </w:rPr>
-        <w:t xml:space="preserve">Deliverable Akhir Minggu</w:t>
+        <w:t xml:space="preserve">Di Luar Scope Minggu Ini</w:t>
       </w:r>
     </w:p>
     <w:p>
@@ -1163,7 +1184,7 @@
           <w:sz w:val="21"/>
           <w:szCs w:val="21"/>
         </w:rPr>
-        <w:t xml:space="preserve">URL staging yang bisa diakses tim untuk review.</w:t>
+        <w:t xml:space="preserve">Fitur e-commerce (shop, cart, checkout) dari situs lama.</w:t>
       </w:r>
     </w:p>
     <w:p>
@@ -1183,7 +1204,7 @@
           <w:sz w:val="21"/>
           <w:szCs w:val="21"/>
         </w:rPr>
-        <w:t xml:space="preserve">7+ halaman: 5 halaman inti + detail destinasi + detail artikel blog.</w:t>
+        <w:t xml:space="preserve">Dukungan multi-bahasa (i18n) penuh.</w:t>
       </w:r>
     </w:p>
     <w:p>
@@ -1203,7 +1224,21 @@
           <w:sz w:val="21"/>
           <w:szCs w:val="21"/>
         </w:rPr>
-        <w:t xml:space="preserve">Fondasi SEO &amp; GEO: sitemap.xml, robots.txt, structured data (Organization, Breadcrumb, FAQ, Article), llms.txt.</w:t>
+        <w:t xml:space="preserve">Language Course Enrollment (registrasi + pembayaran + kalender) — menunggu konfirmasi payment gateway.</w:t>
+      </w:r>
+    </w:p>
+    <w:p>
+      <w:pPr>
+        <w:pStyle w:val="Heading1"/>
+        <w:spacing w:after="140" w:before="320"/>
+      </w:pPr>
+      <w:r>
+        <w:rPr>
+          <w:b/>
+          <w:bCs/>
+          <w:color w:val="14304C"/>
+        </w:rPr>
+        <w:t xml:space="preserve">Risiko &amp; Hal yang Perlu Konfirmasi</w:t>
       </w:r>
     </w:p>
     <w:p>
@@ -1217,13 +1252,13 @@
       </w:pPr>
       <w:r>
         <w:rPr>
-          <w:b w:val="false"/>
-          <w:bCs w:val="false"/>
+          <w:b/>
+          <w:bCs/>
           <w:color w:val="222222"/>
           <w:sz w:val="21"/>
           <w:szCs w:val="21"/>
         </w:rPr>
-        <w:t xml:space="preserve">Laporan QA (matrix perangkat/browser) beserta daftar perbaikan.</w:t>
+        <w:t xml:space="preserve">CMS saat ini menyimpan data di file JSON lokal — perlu dipindah ke database sungguhan sebelum deploy ke hosting serverless (Vercel dkk.), karena filesystem di sana read-only saat runtime.</w:t>
       </w:r>
     </w:p>
     <w:p>
@@ -1237,27 +1272,13 @@
       </w:pPr>
       <w:r>
         <w:rPr>
-          <w:b w:val="false"/>
-          <w:bCs w:val="false"/>
-          <w:color w:val="222222"/>
-          <w:sz w:val="21"/>
-          <w:szCs w:val="21"/>
-        </w:rPr>
-        <w:t xml:space="preserve">Backlog untuk minggu berikutnya.</w:t>
-      </w:r>
-    </w:p>
-    <w:p>
-      <w:pPr>
-        <w:pStyle w:val="Heading1"/>
-        <w:spacing w:after="140" w:before="320"/>
-      </w:pPr>
-      <w:r>
-        <w:rPr>
           <w:b/>
           <w:bCs/>
-          <w:color w:val="14304C"/>
-        </w:rPr>
-        <w:t xml:space="preserve">Di Luar Scope Minggu Ini</w:t>
+          <w:color w:val="222222"/>
+          <w:sz w:val="21"/>
+          <w:szCs w:val="21"/>
+        </w:rPr>
+        <w:t xml:space="preserve">Foto &amp; bio Cindy Christella belum ada — halaman Team masih pakai placeholder yang jujur.</w:t>
       </w:r>
     </w:p>
     <w:p>
@@ -1271,13 +1292,13 @@
       </w:pPr>
       <w:r>
         <w:rPr>
-          <w:b w:val="false"/>
-          <w:bCs w:val="false"/>
+          <w:b/>
+          <w:bCs/>
           <w:color w:val="222222"/>
           <w:sz w:val="21"/>
           <w:szCs w:val="21"/>
         </w:rPr>
-        <w:t xml:space="preserve">Migrasi penuh backend/CMS dari WordPress.</w:t>
+        <w:t xml:space="preserve">Nomor telepon/alamat kantor resmi (selain WhatsApp) belum dikonfirmasi tim — data lama di situs WordPress adalah data demo tema, tidak valid.</w:t>
       </w:r>
     </w:p>
     <w:p>
@@ -1291,53 +1312,13 @@
       </w:pPr>
       <w:r>
         <w:rPr>
-          <w:b w:val="false"/>
-          <w:bCs w:val="false"/>
+          <w:b/>
+          <w:bCs/>
           <w:color w:val="222222"/>
           <w:sz w:val="21"/>
           <w:szCs w:val="21"/>
         </w:rPr>
-        <w:t xml:space="preserve">Fitur e-commerce (shop, cart, checkout) dari situs lama.</w:t>
-      </w:r>
-    </w:p>
-    <w:p>
-      <w:pPr>
-        <w:pStyle w:val="ListParagraph"/>
-        <w:numPr>
-          <w:ilvl w:val="0"/>
-          <w:numId w:val="2"/>
-        </w:numPr>
-        <w:spacing w:after="60"/>
-      </w:pPr>
-      <w:r>
-        <w:rPr>
-          <w:b w:val="false"/>
-          <w:bCs w:val="false"/>
-          <w:color w:val="222222"/>
-          <w:sz w:val="21"/>
-          <w:szCs w:val="21"/>
-        </w:rPr>
-        <w:t xml:space="preserve">Dukungan multi-bahasa (i18n) penuh.</w:t>
-      </w:r>
-    </w:p>
-    <w:p>
-      <w:pPr>
-        <w:pStyle w:val="ListParagraph"/>
-        <w:numPr>
-          <w:ilvl w:val="0"/>
-          <w:numId w:val="2"/>
-        </w:numPr>
-        <w:spacing w:after="60"/>
-      </w:pPr>
-      <w:r>
-        <w:rPr>
-          <w:b w:val="false"/>
-          <w:bCs w:val="false"/>
-          <w:color w:val="222222"/>
-          <w:sz w:val="21"/>
-          <w:szCs w:val="21"/>
-        </w:rPr>
-        <w:t xml:space="preserve">Form kontak fungsional dengan backend/pengiriman email.</w:t>
+        <w:t xml:space="preserve">Payment gateway untuk fitur Language Course Enrollment belum ditentukan — memengaruhi kapan fitur itu bisa mulai dikerjakan.</w:t>
       </w:r>
     </w:p>
     <w:p>
@@ -1351,69 +1332,821 @@
           <w:bCs/>
           <w:color w:val="14304C"/>
         </w:rPr>
-        <w:t xml:space="preserve">Risiko &amp; Hal yang Perlu Konfirmasi</w:t>
-      </w:r>
-    </w:p>
-    <w:p>
-      <w:pPr>
-        <w:pStyle w:val="ListParagraph"/>
-        <w:numPr>
-          <w:ilvl w:val="0"/>
-          <w:numId w:val="2"/>
-        </w:numPr>
-        <w:spacing w:after="60"/>
-      </w:pPr>
-      <w:r>
-        <w:rPr>
-          <w:b/>
-          <w:bCs/>
-          <w:color w:val="222222"/>
-          <w:sz w:val="21"/>
-          <w:szCs w:val="21"/>
-        </w:rPr>
-        <w:t xml:space="preserve">Konten destinasi (Australia, Malaysia) di situs lama adalah demo tema, bukan konten asli — perlu materi baru dari tim.</w:t>
-      </w:r>
-    </w:p>
-    <w:p>
-      <w:pPr>
-        <w:pStyle w:val="ListParagraph"/>
-        <w:numPr>
-          <w:ilvl w:val="0"/>
-          <w:numId w:val="2"/>
-        </w:numPr>
-        <w:spacing w:after="60"/>
-      </w:pPr>
-      <w:r>
-        <w:rPr>
-          <w:b/>
-          <w:bCs/>
-          <w:color w:val="222222"/>
-          <w:sz w:val="21"/>
-          <w:szCs w:val="21"/>
-        </w:rPr>
-        <w:t xml:space="preserve">Nomor telepon &amp; alamat kantor di halaman kontak situs lama tidak valid (data demo tema) — perlu konfirmasi kontak resmi.</w:t>
-      </w:r>
-    </w:p>
-    <w:p>
-      <w:pPr>
-        <w:pStyle w:val="ListParagraph"/>
-        <w:numPr>
-          <w:ilvl w:val="0"/>
-          <w:numId w:val="2"/>
-        </w:numPr>
-        <w:spacing w:after="60"/>
-      </w:pPr>
-      <w:r>
-        <w:rPr>
-          <w:b/>
-          <w:bCs/>
-          <w:color w:val="222222"/>
-          <w:sz w:val="21"/>
-          <w:szCs w:val="21"/>
-        </w:rPr>
-        <w:t xml:space="preserve">Keputusan penggunaan CMS (headless CMS vs konten statis) untuk blog belum final — memengaruhi arsitektur route /blog/[slug].</w:t>
-      </w:r>
-    </w:p>
+        <w:t xml:space="preserve">Rencana Minggu Depan (27–31 Juli 2026)</w:t>
+      </w:r>
+    </w:p>
+    <w:tbl>
+      <w:tblPr>
+        <w:tblW w:type="dxa" w:w="9800"/>
+        <w:tblBorders>
+          <w:top w:val="single" w:color="auto" w:sz="4"/>
+          <w:left w:val="single" w:color="auto" w:sz="4"/>
+          <w:bottom w:val="single" w:color="auto" w:sz="4"/>
+          <w:right w:val="single" w:color="auto" w:sz="4"/>
+          <w:insideH w:val="single" w:color="auto" w:sz="4"/>
+          <w:insideV w:val="single" w:color="auto" w:sz="4"/>
+        </w:tblBorders>
+      </w:tblPr>
+      <w:tblGrid>
+        <w:gridCol w:w="1400"/>
+        <w:gridCol w:w="2000"/>
+        <w:gridCol w:w="4600"/>
+        <w:gridCol w:w="1800"/>
+      </w:tblGrid>
+      <w:tr>
+        <w:trPr>
+          <w:tblHeader/>
+        </w:trPr>
+        <w:tc>
+          <w:tcPr>
+            <w:tcW w:type="dxa" w:w="1400"/>
+            <w:shd w:fill="14304C" w:val="clear"/>
+            <w:tcMar>
+              <w:top w:type="dxa" w:w="100"/>
+              <w:left w:type="dxa" w:w="120"/>
+              <w:bottom w:type="dxa" w:w="100"/>
+              <w:right w:type="dxa" w:w="120"/>
+            </w:tcMar>
+          </w:tcPr>
+          <w:p>
+            <w:pPr>
+              <w:spacing w:after="0"/>
+            </w:pPr>
+            <w:r>
+              <w:rPr>
+                <w:b/>
+                <w:bCs/>
+                <w:color w:val="FFFFFF"/>
+                <w:sz w:val="20"/>
+                <w:szCs w:val="20"/>
+              </w:rPr>
+              <w:t xml:space="preserve">Hari</w:t>
+            </w:r>
+          </w:p>
+        </w:tc>
+        <w:tc>
+          <w:tcPr>
+            <w:tcW w:type="dxa" w:w="2000"/>
+            <w:shd w:fill="14304C" w:val="clear"/>
+            <w:tcMar>
+              <w:top w:type="dxa" w:w="100"/>
+              <w:left w:type="dxa" w:w="120"/>
+              <w:bottom w:type="dxa" w:w="100"/>
+              <w:right w:type="dxa" w:w="120"/>
+            </w:tcMar>
+          </w:tcPr>
+          <w:p>
+            <w:pPr>
+              <w:spacing w:after="0"/>
+            </w:pPr>
+            <w:r>
+              <w:rPr>
+                <w:b/>
+                <w:bCs/>
+                <w:color w:val="FFFFFF"/>
+                <w:sz w:val="20"/>
+                <w:szCs w:val="20"/>
+              </w:rPr>
+              <w:t xml:space="preserve">Fokus</w:t>
+            </w:r>
+          </w:p>
+        </w:tc>
+        <w:tc>
+          <w:tcPr>
+            <w:tcW w:type="dxa" w:w="4600"/>
+            <w:shd w:fill="14304C" w:val="clear"/>
+            <w:tcMar>
+              <w:top w:type="dxa" w:w="100"/>
+              <w:left w:type="dxa" w:w="120"/>
+              <w:bottom w:type="dxa" w:w="100"/>
+              <w:right w:type="dxa" w:w="120"/>
+            </w:tcMar>
+          </w:tcPr>
+          <w:p>
+            <w:pPr>
+              <w:spacing w:after="0"/>
+            </w:pPr>
+            <w:r>
+              <w:rPr>
+                <w:b/>
+                <w:bCs/>
+                <w:color w:val="FFFFFF"/>
+                <w:sz w:val="20"/>
+                <w:szCs w:val="20"/>
+              </w:rPr>
+              <w:t xml:space="preserve">Tugas Utama</w:t>
+            </w:r>
+          </w:p>
+        </w:tc>
+        <w:tc>
+          <w:tcPr>
+            <w:tcW w:type="dxa" w:w="1800"/>
+            <w:shd w:fill="14304C" w:val="clear"/>
+            <w:tcMar>
+              <w:top w:type="dxa" w:w="100"/>
+              <w:left w:type="dxa" w:w="120"/>
+              <w:bottom w:type="dxa" w:w="100"/>
+              <w:right w:type="dxa" w:w="120"/>
+            </w:tcMar>
+          </w:tcPr>
+          <w:p>
+            <w:pPr>
+              <w:spacing w:after="0"/>
+            </w:pPr>
+            <w:r>
+              <w:rPr>
+                <w:b/>
+                <w:bCs/>
+                <w:color w:val="FFFFFF"/>
+                <w:sz w:val="20"/>
+                <w:szCs w:val="20"/>
+              </w:rPr>
+              <w:t xml:space="preserve">Output</w:t>
+            </w:r>
+          </w:p>
+        </w:tc>
+      </w:tr>
+      <w:tr>
+        <w:tc>
+          <w:tcPr>
+            <w:tcW w:type="dxa" w:w="1400"/>
+            <w:tcMar>
+              <w:top w:type="dxa" w:w="100"/>
+              <w:left w:type="dxa" w:w="120"/>
+              <w:bottom w:type="dxa" w:w="100"/>
+              <w:right w:type="dxa" w:w="120"/>
+            </w:tcMar>
+          </w:tcPr>
+          <w:p>
+            <w:pPr>
+              <w:spacing w:after="60"/>
+            </w:pPr>
+            <w:r>
+              <w:rPr>
+                <w:b/>
+                <w:bCs/>
+                <w:color w:val="222222"/>
+                <w:sz w:val="20"/>
+                <w:szCs w:val="20"/>
+              </w:rPr>
+              <w:t xml:space="preserve">Sen</w:t>
+            </w:r>
+          </w:p>
+          <w:p>
+            <w:pPr>
+              <w:spacing w:after="0"/>
+            </w:pPr>
+            <w:r>
+              <w:rPr>
+                <w:b/>
+                <w:bCs/>
+                <w:color w:val="222222"/>
+                <w:sz w:val="20"/>
+                <w:szCs w:val="20"/>
+              </w:rPr>
+              <w:t xml:space="preserve">27 Jul</w:t>
+            </w:r>
+          </w:p>
+        </w:tc>
+        <w:tc>
+          <w:tcPr>
+            <w:tcW w:type="dxa" w:w="2000"/>
+            <w:tcMar>
+              <w:top w:type="dxa" w:w="100"/>
+              <w:left w:type="dxa" w:w="120"/>
+              <w:bottom w:type="dxa" w:w="100"/>
+              <w:right w:type="dxa" w:w="120"/>
+            </w:tcMar>
+          </w:tcPr>
+          <w:p>
+            <w:pPr>
+              <w:spacing w:after="0"/>
+            </w:pPr>
+            <w:r>
+              <w:rPr>
+                <w:b/>
+                <w:bCs/>
+                <w:color w:val="222222"/>
+                <w:sz w:val="20"/>
+                <w:szCs w:val="20"/>
+              </w:rPr>
+              <w:t xml:space="preserve">Migrasi Database</w:t>
+            </w:r>
+          </w:p>
+        </w:tc>
+        <w:tc>
+          <w:tcPr>
+            <w:tcW w:type="dxa" w:w="4600"/>
+            <w:tcMar>
+              <w:top w:type="dxa" w:w="100"/>
+              <w:left w:type="dxa" w:w="120"/>
+              <w:bottom w:type="dxa" w:w="100"/>
+              <w:right w:type="dxa" w:w="120"/>
+            </w:tcMar>
+          </w:tcPr>
+          <w:p>
+            <w:pPr>
+              <w:spacing w:after="60"/>
+            </w:pPr>
+            <w:r>
+              <w:rPr>
+                <w:b w:val="false"/>
+                <w:bCs w:val="false"/>
+                <w:color w:val="222222"/>
+                <w:sz w:val="20"/>
+                <w:szCs w:val="20"/>
+              </w:rPr>
+              <w:t xml:space="preserve">• Pindahkan penyimpanan CMS dari file JSON lokal ke database (Postgres/Supabase)</w:t>
+            </w:r>
+          </w:p>
+          <w:p>
+            <w:pPr>
+              <w:spacing w:after="0"/>
+            </w:pPr>
+            <w:r>
+              <w:rPr>
+                <w:b w:val="false"/>
+                <w:bCs w:val="false"/>
+                <w:color w:val="222222"/>
+                <w:sz w:val="20"/>
+                <w:szCs w:val="20"/>
+              </w:rPr>
+              <w:t xml:space="preserve">• Uji ulang seluruh alur simpan-CMS setelah migrasi</w:t>
+            </w:r>
+          </w:p>
+        </w:tc>
+        <w:tc>
+          <w:tcPr>
+            <w:tcW w:type="dxa" w:w="1800"/>
+            <w:tcMar>
+              <w:top w:type="dxa" w:w="100"/>
+              <w:left w:type="dxa" w:w="120"/>
+              <w:bottom w:type="dxa" w:w="100"/>
+              <w:right w:type="dxa" w:w="120"/>
+            </w:tcMar>
+          </w:tcPr>
+          <w:p>
+            <w:pPr>
+              <w:spacing w:after="0"/>
+            </w:pPr>
+            <w:r>
+              <w:rPr>
+                <w:b w:val="false"/>
+                <w:bCs w:val="false"/>
+                <w:color w:val="222222"/>
+                <w:sz w:val="20"/>
+                <w:szCs w:val="20"/>
+              </w:rPr>
+              <w:t xml:space="preserve">CMS siap dipakai di hosting serverless</w:t>
+            </w:r>
+          </w:p>
+        </w:tc>
+      </w:tr>
+      <w:tr>
+        <w:tc>
+          <w:tcPr>
+            <w:tcW w:type="dxa" w:w="1400"/>
+            <w:tcMar>
+              <w:top w:type="dxa" w:w="100"/>
+              <w:left w:type="dxa" w:w="120"/>
+              <w:bottom w:type="dxa" w:w="100"/>
+              <w:right w:type="dxa" w:w="120"/>
+            </w:tcMar>
+          </w:tcPr>
+          <w:p>
+            <w:pPr>
+              <w:spacing w:after="60"/>
+            </w:pPr>
+            <w:r>
+              <w:rPr>
+                <w:b/>
+                <w:bCs/>
+                <w:color w:val="222222"/>
+                <w:sz w:val="20"/>
+                <w:szCs w:val="20"/>
+              </w:rPr>
+              <w:t xml:space="preserve">Sel</w:t>
+            </w:r>
+          </w:p>
+          <w:p>
+            <w:pPr>
+              <w:spacing w:after="0"/>
+            </w:pPr>
+            <w:r>
+              <w:rPr>
+                <w:b/>
+                <w:bCs/>
+                <w:color w:val="222222"/>
+                <w:sz w:val="20"/>
+                <w:szCs w:val="20"/>
+              </w:rPr>
+              <w:t xml:space="preserve">28 Jul</w:t>
+            </w:r>
+          </w:p>
+        </w:tc>
+        <w:tc>
+          <w:tcPr>
+            <w:tcW w:type="dxa" w:w="2000"/>
+            <w:tcMar>
+              <w:top w:type="dxa" w:w="100"/>
+              <w:left w:type="dxa" w:w="120"/>
+              <w:bottom w:type="dxa" w:w="100"/>
+              <w:right w:type="dxa" w:w="120"/>
+            </w:tcMar>
+          </w:tcPr>
+          <w:p>
+            <w:pPr>
+              <w:spacing w:after="0"/>
+            </w:pPr>
+            <w:r>
+              <w:rPr>
+                <w:b/>
+                <w:bCs/>
+                <w:color w:val="222222"/>
+                <w:sz w:val="20"/>
+                <w:szCs w:val="20"/>
+              </w:rPr>
+              <w:t xml:space="preserve">Form Kontak &amp; Konsultasi Fungsional</w:t>
+            </w:r>
+          </w:p>
+        </w:tc>
+        <w:tc>
+          <w:tcPr>
+            <w:tcW w:type="dxa" w:w="4600"/>
+            <w:tcMar>
+              <w:top w:type="dxa" w:w="100"/>
+              <w:left w:type="dxa" w:w="120"/>
+              <w:bottom w:type="dxa" w:w="100"/>
+              <w:right w:type="dxa" w:w="120"/>
+            </w:tcMar>
+          </w:tcPr>
+          <w:p>
+            <w:pPr>
+              <w:spacing w:after="60"/>
+            </w:pPr>
+            <w:r>
+              <w:rPr>
+                <w:b w:val="false"/>
+                <w:bCs w:val="false"/>
+                <w:color w:val="222222"/>
+                <w:sz w:val="20"/>
+                <w:szCs w:val="20"/>
+              </w:rPr>
+              <w:t xml:space="preserve">• Sambungkan form Free Consultation &amp; Contact ke backend (email/notifikasi WhatsApp)</w:t>
+            </w:r>
+          </w:p>
+          <w:p>
+            <w:pPr>
+              <w:spacing w:after="0"/>
+            </w:pPr>
+            <w:r>
+              <w:rPr>
+                <w:b w:val="false"/>
+                <w:bCs w:val="false"/>
+                <w:color w:val="222222"/>
+                <w:sz w:val="20"/>
+                <w:szCs w:val="20"/>
+              </w:rPr>
+              <w:t xml:space="preserve">• Validasi input &amp; pesan error yang jelas</w:t>
+            </w:r>
+          </w:p>
+        </w:tc>
+        <w:tc>
+          <w:tcPr>
+            <w:tcW w:type="dxa" w:w="1800"/>
+            <w:tcMar>
+              <w:top w:type="dxa" w:w="100"/>
+              <w:left w:type="dxa" w:w="120"/>
+              <w:bottom w:type="dxa" w:w="100"/>
+              <w:right w:type="dxa" w:w="120"/>
+            </w:tcMar>
+          </w:tcPr>
+          <w:p>
+            <w:pPr>
+              <w:spacing w:after="0"/>
+            </w:pPr>
+            <w:r>
+              <w:rPr>
+                <w:b w:val="false"/>
+                <w:bCs w:val="false"/>
+                <w:color w:val="222222"/>
+                <w:sz w:val="20"/>
+                <w:szCs w:val="20"/>
+              </w:rPr>
+              <w:t xml:space="preserve">Form benar-benar mengirim data, bukan mockup</w:t>
+            </w:r>
+          </w:p>
+        </w:tc>
+      </w:tr>
+      <w:tr>
+        <w:tc>
+          <w:tcPr>
+            <w:tcW w:type="dxa" w:w="1400"/>
+            <w:tcMar>
+              <w:top w:type="dxa" w:w="100"/>
+              <w:left w:type="dxa" w:w="120"/>
+              <w:bottom w:type="dxa" w:w="100"/>
+              <w:right w:type="dxa" w:w="120"/>
+            </w:tcMar>
+          </w:tcPr>
+          <w:p>
+            <w:pPr>
+              <w:spacing w:after="60"/>
+            </w:pPr>
+            <w:r>
+              <w:rPr>
+                <w:b/>
+                <w:bCs/>
+                <w:color w:val="222222"/>
+                <w:sz w:val="20"/>
+                <w:szCs w:val="20"/>
+              </w:rPr>
+              <w:t xml:space="preserve">Rab</w:t>
+            </w:r>
+          </w:p>
+          <w:p>
+            <w:pPr>
+              <w:spacing w:after="0"/>
+            </w:pPr>
+            <w:r>
+              <w:rPr>
+                <w:b/>
+                <w:bCs/>
+                <w:color w:val="222222"/>
+                <w:sz w:val="20"/>
+                <w:szCs w:val="20"/>
+              </w:rPr>
+              <w:t xml:space="preserve">29 Jul</w:t>
+            </w:r>
+          </w:p>
+        </w:tc>
+        <w:tc>
+          <w:tcPr>
+            <w:tcW w:type="dxa" w:w="2000"/>
+            <w:tcMar>
+              <w:top w:type="dxa" w:w="100"/>
+              <w:left w:type="dxa" w:w="120"/>
+              <w:bottom w:type="dxa" w:w="100"/>
+              <w:right w:type="dxa" w:w="120"/>
+            </w:tcMar>
+          </w:tcPr>
+          <w:p>
+            <w:pPr>
+              <w:spacing w:after="0"/>
+            </w:pPr>
+            <w:r>
+              <w:rPr>
+                <w:b/>
+                <w:bCs/>
+                <w:color w:val="222222"/>
+                <w:sz w:val="20"/>
+                <w:szCs w:val="20"/>
+              </w:rPr>
+              <w:t xml:space="preserve">Analytics &amp; Tracking</w:t>
+            </w:r>
+          </w:p>
+        </w:tc>
+        <w:tc>
+          <w:tcPr>
+            <w:tcW w:type="dxa" w:w="4600"/>
+            <w:tcMar>
+              <w:top w:type="dxa" w:w="100"/>
+              <w:left w:type="dxa" w:w="120"/>
+              <w:bottom w:type="dxa" w:w="100"/>
+              <w:right w:type="dxa" w:w="120"/>
+            </w:tcMar>
+          </w:tcPr>
+          <w:p>
+            <w:pPr>
+              <w:spacing w:after="60"/>
+            </w:pPr>
+            <w:r>
+              <w:rPr>
+                <w:b w:val="false"/>
+                <w:bCs w:val="false"/>
+                <w:color w:val="222222"/>
+                <w:sz w:val="20"/>
+                <w:szCs w:val="20"/>
+              </w:rPr>
+              <w:t xml:space="preserve">• Pasang Google Analytics / Meta Pixel sesuai kebutuhan marketing</w:t>
+            </w:r>
+          </w:p>
+          <w:p>
+            <w:pPr>
+              <w:spacing w:after="0"/>
+            </w:pPr>
+            <w:r>
+              <w:rPr>
+                <w:b w:val="false"/>
+                <w:bCs w:val="false"/>
+                <w:color w:val="222222"/>
+                <w:sz w:val="20"/>
+                <w:szCs w:val="20"/>
+              </w:rPr>
+              <w:t xml:space="preserve">• Setup event tracking untuk klik WhatsApp &amp; submit form</w:t>
+            </w:r>
+          </w:p>
+        </w:tc>
+        <w:tc>
+          <w:tcPr>
+            <w:tcW w:type="dxa" w:w="1800"/>
+            <w:tcMar>
+              <w:top w:type="dxa" w:w="100"/>
+              <w:left w:type="dxa" w:w="120"/>
+              <w:bottom w:type="dxa" w:w="100"/>
+              <w:right w:type="dxa" w:w="120"/>
+            </w:tcMar>
+          </w:tcPr>
+          <w:p>
+            <w:pPr>
+              <w:spacing w:after="0"/>
+            </w:pPr>
+            <w:r>
+              <w:rPr>
+                <w:b w:val="false"/>
+                <w:bCs w:val="false"/>
+                <w:color w:val="222222"/>
+                <w:sz w:val="20"/>
+                <w:szCs w:val="20"/>
+              </w:rPr>
+              <w:t xml:space="preserve">Data traffic &amp; konversi mulai terekam</w:t>
+            </w:r>
+          </w:p>
+        </w:tc>
+      </w:tr>
+      <w:tr>
+        <w:tc>
+          <w:tcPr>
+            <w:tcW w:type="dxa" w:w="1400"/>
+            <w:tcMar>
+              <w:top w:type="dxa" w:w="100"/>
+              <w:left w:type="dxa" w:w="120"/>
+              <w:bottom w:type="dxa" w:w="100"/>
+              <w:right w:type="dxa" w:w="120"/>
+            </w:tcMar>
+          </w:tcPr>
+          <w:p>
+            <w:pPr>
+              <w:spacing w:after="60"/>
+            </w:pPr>
+            <w:r>
+              <w:rPr>
+                <w:b/>
+                <w:bCs/>
+                <w:color w:val="222222"/>
+                <w:sz w:val="20"/>
+                <w:szCs w:val="20"/>
+              </w:rPr>
+              <w:t xml:space="preserve">Kam</w:t>
+            </w:r>
+          </w:p>
+          <w:p>
+            <w:pPr>
+              <w:spacing w:after="0"/>
+            </w:pPr>
+            <w:r>
+              <w:rPr>
+                <w:b/>
+                <w:bCs/>
+                <w:color w:val="222222"/>
+                <w:sz w:val="20"/>
+                <w:szCs w:val="20"/>
+              </w:rPr>
+              <w:t xml:space="preserve">30 Jul</w:t>
+            </w:r>
+          </w:p>
+        </w:tc>
+        <w:tc>
+          <w:tcPr>
+            <w:tcW w:type="dxa" w:w="2000"/>
+            <w:tcMar>
+              <w:top w:type="dxa" w:w="100"/>
+              <w:left w:type="dxa" w:w="120"/>
+              <w:bottom w:type="dxa" w:w="100"/>
+              <w:right w:type="dxa" w:w="120"/>
+            </w:tcMar>
+          </w:tcPr>
+          <w:p>
+            <w:pPr>
+              <w:spacing w:after="0"/>
+            </w:pPr>
+            <w:r>
+              <w:rPr>
+                <w:b/>
+                <w:bCs/>
+                <w:color w:val="222222"/>
+                <w:sz w:val="20"/>
+                <w:szCs w:val="20"/>
+              </w:rPr>
+              <w:t xml:space="preserve">Konten Tambahan</w:t>
+            </w:r>
+          </w:p>
+        </w:tc>
+        <w:tc>
+          <w:tcPr>
+            <w:tcW w:type="dxa" w:w="4600"/>
+            <w:tcMar>
+              <w:top w:type="dxa" w:w="100"/>
+              <w:left w:type="dxa" w:w="120"/>
+              <w:bottom w:type="dxa" w:w="100"/>
+              <w:right w:type="dxa" w:w="120"/>
+            </w:tcMar>
+          </w:tcPr>
+          <w:p>
+            <w:pPr>
+              <w:spacing w:after="60"/>
+            </w:pPr>
+            <w:r>
+              <w:rPr>
+                <w:b w:val="false"/>
+                <w:bCs w:val="false"/>
+                <w:color w:val="222222"/>
+                <w:sz w:val="20"/>
+                <w:szCs w:val="20"/>
+              </w:rPr>
+              <w:t xml:space="preserve">• Lengkapi konten negara selain Australia (jika materi dari tim sudah tersedia)</w:t>
+            </w:r>
+          </w:p>
+          <w:p>
+            <w:pPr>
+              <w:spacing w:after="0"/>
+            </w:pPr>
+            <w:r>
+              <w:rPr>
+                <w:b w:val="false"/>
+                <w:bCs w:val="false"/>
+                <w:color w:val="222222"/>
+                <w:sz w:val="20"/>
+                <w:szCs w:val="20"/>
+              </w:rPr>
+              <w:t xml:space="preserve">• Foto &amp; bio Cindy Christella (menunggu materi dari tim)</w:t>
+            </w:r>
+          </w:p>
+        </w:tc>
+        <w:tc>
+          <w:tcPr>
+            <w:tcW w:type="dxa" w:w="1800"/>
+            <w:tcMar>
+              <w:top w:type="dxa" w:w="100"/>
+              <w:left w:type="dxa" w:w="120"/>
+              <w:bottom w:type="dxa" w:w="100"/>
+              <w:right w:type="dxa" w:w="120"/>
+            </w:tcMar>
+          </w:tcPr>
+          <w:p>
+            <w:pPr>
+              <w:spacing w:after="0"/>
+            </w:pPr>
+            <w:r>
+              <w:rPr>
+                <w:b w:val="false"/>
+                <w:bCs w:val="false"/>
+                <w:color w:val="222222"/>
+                <w:sz w:val="20"/>
+                <w:szCs w:val="20"/>
+              </w:rPr>
+              <w:t xml:space="preserve">Halaman negara lain sekomprehensif Australia</w:t>
+            </w:r>
+          </w:p>
+        </w:tc>
+      </w:tr>
+      <w:tr>
+        <w:tc>
+          <w:tcPr>
+            <w:tcW w:type="dxa" w:w="1400"/>
+            <w:tcMar>
+              <w:top w:type="dxa" w:w="100"/>
+              <w:left w:type="dxa" w:w="120"/>
+              <w:bottom w:type="dxa" w:w="100"/>
+              <w:right w:type="dxa" w:w="120"/>
+            </w:tcMar>
+          </w:tcPr>
+          <w:p>
+            <w:pPr>
+              <w:spacing w:after="60"/>
+            </w:pPr>
+            <w:r>
+              <w:rPr>
+                <w:b/>
+                <w:bCs/>
+                <w:color w:val="222222"/>
+                <w:sz w:val="20"/>
+                <w:szCs w:val="20"/>
+              </w:rPr>
+              <w:t xml:space="preserve">Jum</w:t>
+            </w:r>
+          </w:p>
+          <w:p>
+            <w:pPr>
+              <w:spacing w:after="0"/>
+            </w:pPr>
+            <w:r>
+              <w:rPr>
+                <w:b/>
+                <w:bCs/>
+                <w:color w:val="222222"/>
+                <w:sz w:val="20"/>
+                <w:szCs w:val="20"/>
+              </w:rPr>
+              <w:t xml:space="preserve">31 Jul</w:t>
+            </w:r>
+          </w:p>
+        </w:tc>
+        <w:tc>
+          <w:tcPr>
+            <w:tcW w:type="dxa" w:w="2000"/>
+            <w:tcMar>
+              <w:top w:type="dxa" w:w="100"/>
+              <w:left w:type="dxa" w:w="120"/>
+              <w:bottom w:type="dxa" w:w="100"/>
+              <w:right w:type="dxa" w:w="120"/>
+            </w:tcMar>
+          </w:tcPr>
+          <w:p>
+            <w:pPr>
+              <w:spacing w:after="0"/>
+            </w:pPr>
+            <w:r>
+              <w:rPr>
+                <w:b/>
+                <w:bCs/>
+                <w:color w:val="222222"/>
+                <w:sz w:val="20"/>
+                <w:szCs w:val="20"/>
+              </w:rPr>
+              <w:t xml:space="preserve">Domain &amp; Persiapan Go-Live</w:t>
+            </w:r>
+          </w:p>
+        </w:tc>
+        <w:tc>
+          <w:tcPr>
+            <w:tcW w:type="dxa" w:w="4600"/>
+            <w:tcMar>
+              <w:top w:type="dxa" w:w="100"/>
+              <w:left w:type="dxa" w:w="120"/>
+              <w:bottom w:type="dxa" w:w="100"/>
+              <w:right w:type="dxa" w:w="120"/>
+            </w:tcMar>
+          </w:tcPr>
+          <w:p>
+            <w:pPr>
+              <w:spacing w:after="60"/>
+            </w:pPr>
+            <w:r>
+              <w:rPr>
+                <w:b w:val="false"/>
+                <w:bCs w:val="false"/>
+                <w:color w:val="222222"/>
+                <w:sz w:val="20"/>
+                <w:szCs w:val="20"/>
+              </w:rPr>
+              <w:t xml:space="preserve">• Setup domain custom &amp; SSL</w:t>
+            </w:r>
+          </w:p>
+          <w:p>
+            <w:pPr>
+              <w:spacing w:after="0"/>
+            </w:pPr>
+            <w:r>
+              <w:rPr>
+                <w:b w:val="false"/>
+                <w:bCs w:val="false"/>
+                <w:color w:val="222222"/>
+                <w:sz w:val="20"/>
+                <w:szCs w:val="20"/>
+              </w:rPr>
+              <w:t xml:space="preserve">• Checklist pra-launch (performance, broken link, SEO meta)</w:t>
+            </w:r>
+          </w:p>
+        </w:tc>
+        <w:tc>
+          <w:tcPr>
+            <w:tcW w:type="dxa" w:w="1800"/>
+            <w:tcMar>
+              <w:top w:type="dxa" w:w="100"/>
+              <w:left w:type="dxa" w:w="120"/>
+              <w:bottom w:type="dxa" w:w="100"/>
+              <w:right w:type="dxa" w:w="120"/>
+            </w:tcMar>
+          </w:tcPr>
+          <w:p>
+            <w:pPr>
+              <w:spacing w:after="0"/>
+            </w:pPr>
+            <w:r>
+              <w:rPr>
+                <w:b w:val="false"/>
+                <w:bCs w:val="false"/>
+                <w:color w:val="222222"/>
+                <w:sz w:val="20"/>
+                <w:szCs w:val="20"/>
+              </w:rPr>
+              <w:t xml:space="preserve">Situs siap diarahkan ke domain resmi</w:t>
+            </w:r>
+          </w:p>
+        </w:tc>
+      </w:tr>
+    </w:tbl>
     <w:p>
       <w:pPr>
         <w:pStyle w:val="Heading1"/>
@@ -1425,22 +2158,685 @@
           <w:bCs/>
           <w:color w:val="14304C"/>
         </w:rPr>
-        <w:t xml:space="preserve">Pratinjau Minggu Depan</w:t>
-      </w:r>
-    </w:p>
-    <w:p>
-      <w:pPr>
-        <w:spacing w:after="140"/>
-      </w:pPr>
-      <w:r>
-        <w:rPr>
-          <w:color w:val="222222"/>
-          <w:sz w:val="21"/>
-          <w:szCs w:val="21"/>
-        </w:rPr>
-        <w:t xml:space="preserve">Integrasi CMS/konten dinamis (jika sudah diputuskan), setup analytics &amp; tracking, pengujian form kontak dengan backend, serta persiapan domain &amp; go-live.</w:t>
-      </w:r>
-    </w:p>
+        <w:t xml:space="preserve">Rencana Minggu Depannya Lagi (3–7 Agustus 2026)</w:t>
+      </w:r>
+    </w:p>
+    <w:tbl>
+      <w:tblPr>
+        <w:tblW w:type="dxa" w:w="9800"/>
+        <w:tblBorders>
+          <w:top w:val="single" w:color="auto" w:sz="4"/>
+          <w:left w:val="single" w:color="auto" w:sz="4"/>
+          <w:bottom w:val="single" w:color="auto" w:sz="4"/>
+          <w:right w:val="single" w:color="auto" w:sz="4"/>
+          <w:insideH w:val="single" w:color="auto" w:sz="4"/>
+          <w:insideV w:val="single" w:color="auto" w:sz="4"/>
+        </w:tblBorders>
+      </w:tblPr>
+      <w:tblGrid>
+        <w:gridCol w:w="1400"/>
+        <w:gridCol w:w="2000"/>
+        <w:gridCol w:w="4600"/>
+        <w:gridCol w:w="1800"/>
+      </w:tblGrid>
+      <w:tr>
+        <w:trPr>
+          <w:tblHeader/>
+        </w:trPr>
+        <w:tc>
+          <w:tcPr>
+            <w:tcW w:type="dxa" w:w="1400"/>
+            <w:shd w:fill="14304C" w:val="clear"/>
+            <w:tcMar>
+              <w:top w:type="dxa" w:w="100"/>
+              <w:left w:type="dxa" w:w="120"/>
+              <w:bottom w:type="dxa" w:w="100"/>
+              <w:right w:type="dxa" w:w="120"/>
+            </w:tcMar>
+          </w:tcPr>
+          <w:p>
+            <w:pPr>
+              <w:spacing w:after="0"/>
+            </w:pPr>
+            <w:r>
+              <w:rPr>
+                <w:b/>
+                <w:bCs/>
+                <w:color w:val="FFFFFF"/>
+                <w:sz w:val="20"/>
+                <w:szCs w:val="20"/>
+              </w:rPr>
+              <w:t xml:space="preserve">Hari</w:t>
+            </w:r>
+          </w:p>
+        </w:tc>
+        <w:tc>
+          <w:tcPr>
+            <w:tcW w:type="dxa" w:w="2000"/>
+            <w:shd w:fill="14304C" w:val="clear"/>
+            <w:tcMar>
+              <w:top w:type="dxa" w:w="100"/>
+              <w:left w:type="dxa" w:w="120"/>
+              <w:bottom w:type="dxa" w:w="100"/>
+              <w:right w:type="dxa" w:w="120"/>
+            </w:tcMar>
+          </w:tcPr>
+          <w:p>
+            <w:pPr>
+              <w:spacing w:after="0"/>
+            </w:pPr>
+            <w:r>
+              <w:rPr>
+                <w:b/>
+                <w:bCs/>
+                <w:color w:val="FFFFFF"/>
+                <w:sz w:val="20"/>
+                <w:szCs w:val="20"/>
+              </w:rPr>
+              <w:t xml:space="preserve">Fokus</w:t>
+            </w:r>
+          </w:p>
+        </w:tc>
+        <w:tc>
+          <w:tcPr>
+            <w:tcW w:type="dxa" w:w="4600"/>
+            <w:shd w:fill="14304C" w:val="clear"/>
+            <w:tcMar>
+              <w:top w:type="dxa" w:w="100"/>
+              <w:left w:type="dxa" w:w="120"/>
+              <w:bottom w:type="dxa" w:w="100"/>
+              <w:right w:type="dxa" w:w="120"/>
+            </w:tcMar>
+          </w:tcPr>
+          <w:p>
+            <w:pPr>
+              <w:spacing w:after="0"/>
+            </w:pPr>
+            <w:r>
+              <w:rPr>
+                <w:b/>
+                <w:bCs/>
+                <w:color w:val="FFFFFF"/>
+                <w:sz w:val="20"/>
+                <w:szCs w:val="20"/>
+              </w:rPr>
+              <w:t xml:space="preserve">Tugas Utama</w:t>
+            </w:r>
+          </w:p>
+        </w:tc>
+        <w:tc>
+          <w:tcPr>
+            <w:tcW w:type="dxa" w:w="1800"/>
+            <w:shd w:fill="14304C" w:val="clear"/>
+            <w:tcMar>
+              <w:top w:type="dxa" w:w="100"/>
+              <w:left w:type="dxa" w:w="120"/>
+              <w:bottom w:type="dxa" w:w="100"/>
+              <w:right w:type="dxa" w:w="120"/>
+            </w:tcMar>
+          </w:tcPr>
+          <w:p>
+            <w:pPr>
+              <w:spacing w:after="0"/>
+            </w:pPr>
+            <w:r>
+              <w:rPr>
+                <w:b/>
+                <w:bCs/>
+                <w:color w:val="FFFFFF"/>
+                <w:sz w:val="20"/>
+                <w:szCs w:val="20"/>
+              </w:rPr>
+              <w:t xml:space="preserve">Output</w:t>
+            </w:r>
+          </w:p>
+        </w:tc>
+      </w:tr>
+      <w:tr>
+        <w:tc>
+          <w:tcPr>
+            <w:tcW w:type="dxa" w:w="1400"/>
+            <w:tcMar>
+              <w:top w:type="dxa" w:w="100"/>
+              <w:left w:type="dxa" w:w="120"/>
+              <w:bottom w:type="dxa" w:w="100"/>
+              <w:right w:type="dxa" w:w="120"/>
+            </w:tcMar>
+          </w:tcPr>
+          <w:p>
+            <w:pPr>
+              <w:spacing w:after="60"/>
+            </w:pPr>
+            <w:r>
+              <w:rPr>
+                <w:b/>
+                <w:bCs/>
+                <w:color w:val="222222"/>
+                <w:sz w:val="20"/>
+                <w:szCs w:val="20"/>
+              </w:rPr>
+              <w:t xml:space="preserve">Sen</w:t>
+            </w:r>
+          </w:p>
+          <w:p>
+            <w:pPr>
+              <w:spacing w:after="0"/>
+            </w:pPr>
+            <w:r>
+              <w:rPr>
+                <w:b/>
+                <w:bCs/>
+                <w:color w:val="222222"/>
+                <w:sz w:val="20"/>
+                <w:szCs w:val="20"/>
+              </w:rPr>
+              <w:t xml:space="preserve">3 Ags</w:t>
+            </w:r>
+          </w:p>
+        </w:tc>
+        <w:tc>
+          <w:tcPr>
+            <w:tcW w:type="dxa" w:w="2000"/>
+            <w:tcMar>
+              <w:top w:type="dxa" w:w="100"/>
+              <w:left w:type="dxa" w:w="120"/>
+              <w:bottom w:type="dxa" w:w="100"/>
+              <w:right w:type="dxa" w:w="120"/>
+            </w:tcMar>
+          </w:tcPr>
+          <w:p>
+            <w:pPr>
+              <w:spacing w:after="0"/>
+            </w:pPr>
+            <w:r>
+              <w:rPr>
+                <w:b/>
+                <w:bCs/>
+                <w:color w:val="222222"/>
+                <w:sz w:val="20"/>
+                <w:szCs w:val="20"/>
+              </w:rPr>
+              <w:t xml:space="preserve">Go-Live</w:t>
+            </w:r>
+          </w:p>
+        </w:tc>
+        <w:tc>
+          <w:tcPr>
+            <w:tcW w:type="dxa" w:w="4600"/>
+            <w:tcMar>
+              <w:top w:type="dxa" w:w="100"/>
+              <w:left w:type="dxa" w:w="120"/>
+              <w:bottom w:type="dxa" w:w="100"/>
+              <w:right w:type="dxa" w:w="120"/>
+            </w:tcMar>
+          </w:tcPr>
+          <w:p>
+            <w:pPr>
+              <w:spacing w:after="60"/>
+            </w:pPr>
+            <w:r>
+              <w:rPr>
+                <w:b w:val="false"/>
+                <w:bCs w:val="false"/>
+                <w:color w:val="222222"/>
+                <w:sz w:val="20"/>
+                <w:szCs w:val="20"/>
+              </w:rPr>
+              <w:t xml:space="preserve">• Arahkan domain resmi ke situs baru</w:t>
+            </w:r>
+          </w:p>
+          <w:p>
+            <w:pPr>
+              <w:spacing w:after="0"/>
+            </w:pPr>
+            <w:r>
+              <w:rPr>
+                <w:b w:val="false"/>
+                <w:bCs w:val="false"/>
+                <w:color w:val="222222"/>
+                <w:sz w:val="20"/>
+                <w:szCs w:val="20"/>
+              </w:rPr>
+              <w:t xml:space="preserve">• Pantau uptime &amp; error di 24 jam pertama</w:t>
+            </w:r>
+          </w:p>
+        </w:tc>
+        <w:tc>
+          <w:tcPr>
+            <w:tcW w:type="dxa" w:w="1800"/>
+            <w:tcMar>
+              <w:top w:type="dxa" w:w="100"/>
+              <w:left w:type="dxa" w:w="120"/>
+              <w:bottom w:type="dxa" w:w="100"/>
+              <w:right w:type="dxa" w:w="120"/>
+            </w:tcMar>
+          </w:tcPr>
+          <w:p>
+            <w:pPr>
+              <w:spacing w:after="0"/>
+            </w:pPr>
+            <w:r>
+              <w:rPr>
+                <w:b w:val="false"/>
+                <w:bCs w:val="false"/>
+                <w:color w:val="222222"/>
+                <w:sz w:val="20"/>
+                <w:szCs w:val="20"/>
+              </w:rPr>
+              <w:t xml:space="preserve">Situs baru live di domain resmi</w:t>
+            </w:r>
+          </w:p>
+        </w:tc>
+      </w:tr>
+      <w:tr>
+        <w:tc>
+          <w:tcPr>
+            <w:tcW w:type="dxa" w:w="1400"/>
+            <w:tcMar>
+              <w:top w:type="dxa" w:w="100"/>
+              <w:left w:type="dxa" w:w="120"/>
+              <w:bottom w:type="dxa" w:w="100"/>
+              <w:right w:type="dxa" w:w="120"/>
+            </w:tcMar>
+          </w:tcPr>
+          <w:p>
+            <w:pPr>
+              <w:spacing w:after="60"/>
+            </w:pPr>
+            <w:r>
+              <w:rPr>
+                <w:b/>
+                <w:bCs/>
+                <w:color w:val="222222"/>
+                <w:sz w:val="20"/>
+                <w:szCs w:val="20"/>
+              </w:rPr>
+              <w:t xml:space="preserve">Sel–Rab</w:t>
+            </w:r>
+          </w:p>
+          <w:p>
+            <w:pPr>
+              <w:spacing w:after="0"/>
+            </w:pPr>
+            <w:r>
+              <w:rPr>
+                <w:b/>
+                <w:bCs/>
+                <w:color w:val="222222"/>
+                <w:sz w:val="20"/>
+                <w:szCs w:val="20"/>
+              </w:rPr>
+              <w:t xml:space="preserve">4–5 Ags</w:t>
+            </w:r>
+          </w:p>
+        </w:tc>
+        <w:tc>
+          <w:tcPr>
+            <w:tcW w:type="dxa" w:w="2000"/>
+            <w:tcMar>
+              <w:top w:type="dxa" w:w="100"/>
+              <w:left w:type="dxa" w:w="120"/>
+              <w:bottom w:type="dxa" w:w="100"/>
+              <w:right w:type="dxa" w:w="120"/>
+            </w:tcMar>
+          </w:tcPr>
+          <w:p>
+            <w:pPr>
+              <w:spacing w:after="0"/>
+            </w:pPr>
+            <w:r>
+              <w:rPr>
+                <w:b/>
+                <w:bCs/>
+                <w:color w:val="222222"/>
+                <w:sz w:val="20"/>
+                <w:szCs w:val="20"/>
+              </w:rPr>
+              <w:t xml:space="preserve">Monitoring Pasca-Launch</w:t>
+            </w:r>
+          </w:p>
+        </w:tc>
+        <w:tc>
+          <w:tcPr>
+            <w:tcW w:type="dxa" w:w="4600"/>
+            <w:tcMar>
+              <w:top w:type="dxa" w:w="100"/>
+              <w:left w:type="dxa" w:w="120"/>
+              <w:bottom w:type="dxa" w:w="100"/>
+              <w:right w:type="dxa" w:w="120"/>
+            </w:tcMar>
+          </w:tcPr>
+          <w:p>
+            <w:pPr>
+              <w:spacing w:after="60"/>
+            </w:pPr>
+            <w:r>
+              <w:rPr>
+                <w:b w:val="false"/>
+                <w:bCs w:val="false"/>
+                <w:color w:val="222222"/>
+                <w:sz w:val="20"/>
+                <w:szCs w:val="20"/>
+              </w:rPr>
+              <w:t xml:space="preserve">• Pantau analytics, error log, dan feedback pengguna nyata</w:t>
+            </w:r>
+          </w:p>
+          <w:p>
+            <w:pPr>
+              <w:spacing w:after="0"/>
+            </w:pPr>
+            <w:r>
+              <w:rPr>
+                <w:b w:val="false"/>
+                <w:bCs w:val="false"/>
+                <w:color w:val="222222"/>
+                <w:sz w:val="20"/>
+                <w:szCs w:val="20"/>
+              </w:rPr>
+              <w:t xml:space="preserve">• Perbaikan cepat (hotfix) bila ada isu ditemukan</w:t>
+            </w:r>
+          </w:p>
+        </w:tc>
+        <w:tc>
+          <w:tcPr>
+            <w:tcW w:type="dxa" w:w="1800"/>
+            <w:tcMar>
+              <w:top w:type="dxa" w:w="100"/>
+              <w:left w:type="dxa" w:w="120"/>
+              <w:bottom w:type="dxa" w:w="100"/>
+              <w:right w:type="dxa" w:w="120"/>
+            </w:tcMar>
+          </w:tcPr>
+          <w:p>
+            <w:pPr>
+              <w:spacing w:after="0"/>
+            </w:pPr>
+            <w:r>
+              <w:rPr>
+                <w:b w:val="false"/>
+                <w:bCs w:val="false"/>
+                <w:color w:val="222222"/>
+                <w:sz w:val="20"/>
+                <w:szCs w:val="20"/>
+              </w:rPr>
+              <w:t xml:space="preserve">Situs stabil, isu awal teratasi</w:t>
+            </w:r>
+          </w:p>
+        </w:tc>
+      </w:tr>
+      <w:tr>
+        <w:tc>
+          <w:tcPr>
+            <w:tcW w:type="dxa" w:w="1400"/>
+            <w:tcMar>
+              <w:top w:type="dxa" w:w="100"/>
+              <w:left w:type="dxa" w:w="120"/>
+              <w:bottom w:type="dxa" w:w="100"/>
+              <w:right w:type="dxa" w:w="120"/>
+            </w:tcMar>
+          </w:tcPr>
+          <w:p>
+            <w:pPr>
+              <w:spacing w:after="60"/>
+            </w:pPr>
+            <w:r>
+              <w:rPr>
+                <w:b/>
+                <w:bCs/>
+                <w:color w:val="222222"/>
+                <w:sz w:val="20"/>
+                <w:szCs w:val="20"/>
+              </w:rPr>
+              <w:t xml:space="preserve">Kam</w:t>
+            </w:r>
+          </w:p>
+          <w:p>
+            <w:pPr>
+              <w:spacing w:after="0"/>
+            </w:pPr>
+            <w:r>
+              <w:rPr>
+                <w:b/>
+                <w:bCs/>
+                <w:color w:val="222222"/>
+                <w:sz w:val="20"/>
+                <w:szCs w:val="20"/>
+              </w:rPr>
+              <w:t xml:space="preserve">6 Ags</w:t>
+            </w:r>
+          </w:p>
+        </w:tc>
+        <w:tc>
+          <w:tcPr>
+            <w:tcW w:type="dxa" w:w="2000"/>
+            <w:tcMar>
+              <w:top w:type="dxa" w:w="100"/>
+              <w:left w:type="dxa" w:w="120"/>
+              <w:bottom w:type="dxa" w:w="100"/>
+              <w:right w:type="dxa" w:w="120"/>
+            </w:tcMar>
+          </w:tcPr>
+          <w:p>
+            <w:pPr>
+              <w:spacing w:after="0"/>
+            </w:pPr>
+            <w:r>
+              <w:rPr>
+                <w:b/>
+                <w:bCs/>
+                <w:color w:val="222222"/>
+                <w:sz w:val="20"/>
+                <w:szCs w:val="20"/>
+              </w:rPr>
+              <w:t xml:space="preserve">Fitur Language Course Enrollment (jika prioritas dikonfirmasi)</w:t>
+            </w:r>
+          </w:p>
+        </w:tc>
+        <w:tc>
+          <w:tcPr>
+            <w:tcW w:type="dxa" w:w="4600"/>
+            <w:tcMar>
+              <w:top w:type="dxa" w:w="100"/>
+              <w:left w:type="dxa" w:w="120"/>
+              <w:bottom w:type="dxa" w:w="100"/>
+              <w:right w:type="dxa" w:w="120"/>
+            </w:tcMar>
+          </w:tcPr>
+          <w:p>
+            <w:pPr>
+              <w:spacing w:after="60"/>
+            </w:pPr>
+            <w:r>
+              <w:rPr>
+                <w:b w:val="false"/>
+                <w:bCs w:val="false"/>
+                <w:color w:val="222222"/>
+                <w:sz w:val="20"/>
+                <w:szCs w:val="20"/>
+              </w:rPr>
+              <w:t xml:space="preserve">• Desain alur registrasi → pembayaran → kalender jadwal</w:t>
+            </w:r>
+          </w:p>
+          <w:p>
+            <w:pPr>
+              <w:spacing w:after="0"/>
+            </w:pPr>
+            <w:r>
+              <w:rPr>
+                <w:b w:val="false"/>
+                <w:bCs w:val="false"/>
+                <w:color w:val="222222"/>
+                <w:sz w:val="20"/>
+                <w:szCs w:val="20"/>
+              </w:rPr>
+              <w:t xml:space="preserve">• Konfirmasi payment gateway yang dipakai klien</w:t>
+            </w:r>
+          </w:p>
+        </w:tc>
+        <w:tc>
+          <w:tcPr>
+            <w:tcW w:type="dxa" w:w="1800"/>
+            <w:tcMar>
+              <w:top w:type="dxa" w:w="100"/>
+              <w:left w:type="dxa" w:w="120"/>
+              <w:bottom w:type="dxa" w:w="100"/>
+              <w:right w:type="dxa" w:w="120"/>
+            </w:tcMar>
+          </w:tcPr>
+          <w:p>
+            <w:pPr>
+              <w:spacing w:after="0"/>
+            </w:pPr>
+            <w:r>
+              <w:rPr>
+                <w:b w:val="false"/>
+                <w:bCs w:val="false"/>
+                <w:color w:val="222222"/>
+                <w:sz w:val="20"/>
+                <w:szCs w:val="20"/>
+              </w:rPr>
+              <w:t xml:space="preserve">Rencana teknis fitur enrollment siap</w:t>
+            </w:r>
+          </w:p>
+        </w:tc>
+      </w:tr>
+      <w:tr>
+        <w:tc>
+          <w:tcPr>
+            <w:tcW w:type="dxa" w:w="1400"/>
+            <w:tcMar>
+              <w:top w:type="dxa" w:w="100"/>
+              <w:left w:type="dxa" w:w="120"/>
+              <w:bottom w:type="dxa" w:w="100"/>
+              <w:right w:type="dxa" w:w="120"/>
+            </w:tcMar>
+          </w:tcPr>
+          <w:p>
+            <w:pPr>
+              <w:spacing w:after="60"/>
+            </w:pPr>
+            <w:r>
+              <w:rPr>
+                <w:b/>
+                <w:bCs/>
+                <w:color w:val="222222"/>
+                <w:sz w:val="20"/>
+                <w:szCs w:val="20"/>
+              </w:rPr>
+              <w:t xml:space="preserve">Jum</w:t>
+            </w:r>
+          </w:p>
+          <w:p>
+            <w:pPr>
+              <w:spacing w:after="0"/>
+            </w:pPr>
+            <w:r>
+              <w:rPr>
+                <w:b/>
+                <w:bCs/>
+                <w:color w:val="222222"/>
+                <w:sz w:val="20"/>
+                <w:szCs w:val="20"/>
+              </w:rPr>
+              <w:t xml:space="preserve">7 Ags</w:t>
+            </w:r>
+          </w:p>
+        </w:tc>
+        <w:tc>
+          <w:tcPr>
+            <w:tcW w:type="dxa" w:w="2000"/>
+            <w:tcMar>
+              <w:top w:type="dxa" w:w="100"/>
+              <w:left w:type="dxa" w:w="120"/>
+              <w:bottom w:type="dxa" w:w="100"/>
+              <w:right w:type="dxa" w:w="120"/>
+            </w:tcMar>
+          </w:tcPr>
+          <w:p>
+            <w:pPr>
+              <w:spacing w:after="0"/>
+            </w:pPr>
+            <w:r>
+              <w:rPr>
+                <w:b/>
+                <w:bCs/>
+                <w:color w:val="222222"/>
+                <w:sz w:val="20"/>
+                <w:szCs w:val="20"/>
+              </w:rPr>
+              <w:t xml:space="preserve">Evaluasi &amp; Backlog Bulan Berikutnya</w:t>
+            </w:r>
+          </w:p>
+        </w:tc>
+        <w:tc>
+          <w:tcPr>
+            <w:tcW w:type="dxa" w:w="4600"/>
+            <w:tcMar>
+              <w:top w:type="dxa" w:w="100"/>
+              <w:left w:type="dxa" w:w="120"/>
+              <w:bottom w:type="dxa" w:w="100"/>
+              <w:right w:type="dxa" w:w="120"/>
+            </w:tcMar>
+          </w:tcPr>
+          <w:p>
+            <w:pPr>
+              <w:spacing w:after="60"/>
+            </w:pPr>
+            <w:r>
+              <w:rPr>
+                <w:b w:val="false"/>
+                <w:bCs w:val="false"/>
+                <w:color w:val="222222"/>
+                <w:sz w:val="20"/>
+                <w:szCs w:val="20"/>
+              </w:rPr>
+              <w:t xml:space="preserve">• Review bersama tim: apa yang berjalan baik, apa yang perlu diprioritaskan ulang</w:t>
+            </w:r>
+          </w:p>
+          <w:p>
+            <w:pPr>
+              <w:spacing w:after="0"/>
+            </w:pPr>
+            <w:r>
+              <w:rPr>
+                <w:b w:val="false"/>
+                <w:bCs w:val="false"/>
+                <w:color w:val="222222"/>
+                <w:sz w:val="20"/>
+                <w:szCs w:val="20"/>
+              </w:rPr>
+              <w:t xml:space="preserve">• Susun backlog konten &amp; fitur untuk bulan berikutnya</w:t>
+            </w:r>
+          </w:p>
+        </w:tc>
+        <w:tc>
+          <w:tcPr>
+            <w:tcW w:type="dxa" w:w="1800"/>
+            <w:tcMar>
+              <w:top w:type="dxa" w:w="100"/>
+              <w:left w:type="dxa" w:w="120"/>
+              <w:bottom w:type="dxa" w:w="100"/>
+              <w:right w:type="dxa" w:w="120"/>
+            </w:tcMar>
+          </w:tcPr>
+          <w:p>
+            <w:pPr>
+              <w:spacing w:after="0"/>
+            </w:pPr>
+            <w:r>
+              <w:rPr>
+                <w:b w:val="false"/>
+                <w:bCs w:val="false"/>
+                <w:color w:val="222222"/>
+                <w:sz w:val="20"/>
+                <w:szCs w:val="20"/>
+              </w:rPr>
+              <w:t xml:space="preserve">Backlog bulan berikutnya disepakati</w:t>
+            </w:r>
+          </w:p>
+        </w:tc>
+      </w:tr>
+    </w:tbl>
     <w:sectPr>
       <w:pgSz w:w="11906" w:h="16838" w:orient="portrait"/>
       <w:pgMar w:top="1000" w:right="1100" w:bottom="1000" w:left="1100" w:header="708" w:footer="708" w:gutter="0"/>

</xml_diff>